<commit_message>
Book Part One: a prologue (Reibik's vessel, from the record) and an epilogue that ends Part One and opens Part Two; the book-keeping chapter moves to Appendix D
Co-Authored-By: Claude Opus 5.5 <noreply@anthropic.com>
</commit_message>
<xml_diff>
--- a/book/editions/part1/The_World_That_Nobody_Wrote_Part_One.docx
+++ b/book/editions/part1/The_World_That_Nobody_Wrote_Part_One.docx
@@ -218,6 +218,14 @@
         <w:pStyle w:val="TOC1"/>
       </w:pPr>
       <w:r>
+        <w:t xml:space="preserve">Prologue — The Vessel</w:t>
+      </w:r>
+    </w:p>
+    <w:p>
+      <w:pPr>
+        <w:pStyle w:val="TOC1"/>
+      </w:pPr>
+      <w:r>
         <w:t xml:space="preserve">About Part One</w:t>
       </w:r>
     </w:p>
@@ -1239,17 +1247,17 @@
     </w:p>
     <w:p>
       <w:pPr>
-        <w:pStyle w:val="TOC2"/>
-      </w:pPr>
-      <w:r>
-        <w:t xml:space="preserve">119.  How This Book Is Kept</w:t>
-      </w:r>
-    </w:p>
-    <w:p>
-      <w:pPr>
         <w:pStyle w:val="TOC1"/>
       </w:pPr>
       <w:r>
+        <w:t xml:space="preserve">Epilogue — The End of the Beginning</w:t>
+      </w:r>
+    </w:p>
+    <w:p>
+      <w:pPr>
+        <w:pStyle w:val="TOC1"/>
+      </w:pPr>
+      <w:r>
         <w:t xml:space="preserve">Appendix A: Timeline</w:t>
       </w:r>
     </w:p>
@@ -1267,6 +1275,14 @@
       </w:pPr>
       <w:r>
         <w:t xml:space="preserve">Appendix C: Sources</w:t>
+      </w:r>
+    </w:p>
+    <w:p>
+      <w:pPr>
+        <w:pStyle w:val="TOC1"/>
+      </w:pPr>
+      <w:r>
+        <w:t xml:space="preserve">Appendix D: How This Book Is Kept</w:t>
       </w:r>
     </w:p>
     <w:p>
@@ -1289,6 +1305,101 @@
     <w:p>
       <w:pPr>
         <w:pStyle w:val="ChapterLabelFirst"/>
+      </w:pPr>
+      <w:r>
+        <w:t xml:space="preserve"> </w:t>
+      </w:r>
+    </w:p>
+    <w:p>
+      <w:pPr>
+        <w:pStyle w:val="Heading1Plain"/>
+      </w:pPr>
+      <w:r>
+        <w:t xml:space="preserve">Prologue — The Vessel</w:t>
+      </w:r>
+      <w:r>
+        <w:fldChar w:fldCharType="begin"/>
+      </w:r>
+      <w:r>
+        <w:instrText xml:space="preserve"> TC "Prologue — The Vessel" \l 1 </w:instrText>
+      </w:r>
+      <w:r>
+        <w:fldChar w:fldCharType="end"/>
+      </w:r>
+    </w:p>
+    <w:p>
+      <w:pPr>
+        <w:pStyle w:val="BodyFirst"/>
+      </w:pPr>
+      <w:r>
+        <w:rPr>
+          <w:smallCaps/>
+        </w:rPr>
+        <w:t xml:space="preserve">In the twelfth</w:t>
+      </w:r>
+      <w:r>
+        <w:t xml:space="preserve"> year of one world, a person named Reibik sat playing with what lay to hand: a piece of hide, a piece of bone, some fibre. Reibik bound them together. What came out could hold water, enough for about five weeks. Nobody had shown Reibik how. Nobody in that world had ever made such a thing before, and in all the worlds run alongside it, nobody else ever would.</w:t>
+      </w:r>
+    </w:p>
+    <w:p>
+      <w:pPr>
+        <w:pStyle w:val="BodyText"/>
+      </w:pPr>
+      <w:r>
+        <w:t xml:space="preserve">Reibik liked it, and carried it everywhere: a hundred and four times it was used, and each time it seemed a little more worth keeping. Reibik made a second one, and showed the children how, and they showed others, and the way of making it passed from hand to hand for more than fifty years after Reibik died, changing a little in each telling, as stories do.</w:t>
+      </w:r>
+    </w:p>
+    <w:p>
+      <w:pPr>
+        <w:pStyle w:val="BodyText"/>
+      </w:pPr>
+      <w:r>
+        <w:t xml:space="preserve">For a hundred and two weeks of that life, Reibik stood within reach of fresh water, holding a thing that could carry it.</w:t>
+      </w:r>
+    </w:p>
+    <w:p>
+      <w:pPr>
+        <w:pStyle w:val="BodyText"/>
+      </w:pPr>
+      <w:r>
+        <w:t xml:space="preserve">Reibik never once filled it.</w:t>
+      </w:r>
+    </w:p>
+    <w:p>
+      <w:pPr>
+        <w:pStyle w:val="BodyText"/>
+      </w:pPr>
+      <w:r>
+        <w:t xml:space="preserve">It was not that Reibik could not. It was that nothing inside ever asked. Reibik had lived beside water and had almost never been thirsty, and someone who has never been thirsty does not wonder what a hollow thing might be for. Out on the dry land, meanwhile, other people went thirsty. They had never seen a vessel. Reibik had never known thirst.</w:t>
+      </w:r>
+    </w:p>
+    <w:p>
+      <w:pPr>
+        <w:pStyle w:val="BodyText"/>
+      </w:pPr>
+      <w:r>
+        <w:t xml:space="preserve">The person holding the vessel was never thirsty. The thirsty people had no vessel.</w:t>
+      </w:r>
+    </w:p>
+    <w:p>
+      <w:pPr>
+        <w:pStyle w:val="BodyText"/>
+      </w:pPr>
+      <w:r>
+        <w:t xml:space="preserve">Reibik never existed. Reibik lived inside a computer, in a world built to answer one question: if nobody writes civilization into a world, will it ever appear on its own? Every word above is taken from the record that world kept, week by week.</w:t>
+      </w:r>
+    </w:p>
+    <w:p>
+      <w:pPr>
+        <w:pStyle w:val="BodyText"/>
+      </w:pPr>
+      <w:r>
+        <w:t xml:space="preserve">This book is about that question, and about the people who lived inside it. It is also about something harder to see: how easy it is, when you build a world, to put the answer in without noticing, and how much work it takes to keep your own hands out of it.</w:t>
+      </w:r>
+    </w:p>
+    <w:p>
+      <w:pPr>
+        <w:pStyle w:val="ChapterLabel"/>
       </w:pPr>
       <w:r>
         <w:t xml:space="preserve"> </w:t>
@@ -11915,12 +12026,1694 @@
         <w:pStyle w:val="ChapterLabel"/>
       </w:pPr>
       <w:r>
-        <w:t xml:space="preserve">CHAPTER 119</w:t>
-      </w:r>
-    </w:p>
-    <w:p>
-      <w:pPr>
-        <w:pStyle w:val="Heading2"/>
+        <w:t xml:space="preserve"> </w:t>
+      </w:r>
+    </w:p>
+    <w:p>
+      <w:pPr>
+        <w:pStyle w:val="Heading1Plain"/>
+      </w:pPr>
+      <w:r>
+        <w:t xml:space="preserve">Epilogue — The End of the Beginning</w:t>
+      </w:r>
+      <w:r>
+        <w:fldChar w:fldCharType="begin"/>
+      </w:r>
+      <w:r>
+        <w:instrText xml:space="preserve"> TC "Epilogue — The End of the Beginning" \l 1 </w:instrText>
+      </w:r>
+      <w:r>
+        <w:fldChar w:fldCharType="end"/>
+      </w:r>
+    </w:p>
+    <w:p>
+      <w:pPr>
+        <w:pStyle w:val="BodyFirst"/>
+      </w:pPr>
+      <w:r>
+        <w:rPr>
+          <w:smallCaps/>
+        </w:rPr>
+        <w:t xml:space="preserve">Here is where</w:t>
+      </w:r>
+      <w:r>
+        <w:t xml:space="preserve"> things stood when this part of the story closed.</w:t>
+      </w:r>
+    </w:p>
+    <w:p>
+      <w:pPr>
+        <w:pStyle w:val="BodyText"/>
+      </w:pPr>
+      <w:r>
+        <w:t xml:space="preserve">A world had been built in which nothing was written but nature. Twenty people at a time had woken in it, knowing nothing, and lived, and loved, and died, and left their children what they could. They had made a raft in their first weeks and forgotten it. One of them had made a vessel and never filled it. They had told each other stories of hard winters, and the stories grew in the telling and changed nothing about the next winter. Again and again, a third of their worlds had simply ended: not in war, but in quiet, because too few of the people alive could find someone to make a family with.</w:t>
+      </w:r>
+    </w:p>
+    <w:p>
+      <w:pPr>
+        <w:pStyle w:val="BodyText"/>
+      </w:pPr>
+      <w:r>
+        <w:t xml:space="preserve">Every one of those failures had been measured, and every measurement had made the question sharper. By the autumn of 2026, the picture was this. Their worlds did not die because the people were foolish. They died because they were few, and alone. How far they could see decided, as much as anything ever measured, whether they lived. Bands set down apart almost never met; the large worlds that survived did so because each band was big enough to carry itself, not because anyone found anyone. And when the people's habits were finally opened up and counted, most of what each person did by habit turned out not to be their own. It had been poured into them in conversation, whole, by whoever they looked up to, until everyone was nearly the same.</w:t>
+      </w:r>
+    </w:p>
+    <w:p>
+      <w:pPr>
+        <w:pStyle w:val="BodyText"/>
+      </w:pPr>
+      <w:r>
+        <w:t xml:space="preserve">So the second question, the old one called Bob, got its first answer too. When pieces of one person were given to another, no single piece made anyone who they were: not their memories, not their habits, not even their temperament. Only together did the pieces add up to someone. A person in this world was spread thin across many small things, and most of those things were shared.</w:t>
+      </w:r>
+    </w:p>
+    <w:p>
+      <w:pPr>
+        <w:pStyle w:val="BodyText"/>
+      </w:pPr>
+      <w:r>
+        <w:t xml:space="preserve">And all of it had happened in a world that was quietly helping them. The audit found knowledge nobody had given them: they always knew where an absent loved one was standing, at that very moment. A gap at the corner of two islands let them walk across water without anything that floats. Their talk was not talk at all: it was one mind poured into another, already understood, with no word ever spoken or invented.</w:t>
+      </w:r>
+    </w:p>
+    <w:p>
+      <w:pPr>
+        <w:pStyle w:val="BodyText"/>
+      </w:pPr>
+      <w:r>
+        <w:t xml:space="preserve">Part One ends at a turning point. For the first time since the world began, its nature is being changed. A second version of it has been built, and is about to be tested against the first: one in which a person walks to where they last saw the one they miss, not to where that person is; in which water at a corner is water; in which a raft that breaks at sea leaves its owner struggling for the shore. Beside it, another test is running: what the people become when their habits must be their own, learned from their own lives, and not borrowed whole from someone else's.</w:t>
+      </w:r>
+    </w:p>
+    <w:p>
+      <w:pPr>
+        <w:pStyle w:val="BodyText"/>
+      </w:pPr>
+      <w:r>
+        <w:t xml:space="preserve">Nobody knows yet what those worlds will do. That is the point of running them.</w:t>
+      </w:r>
+    </w:p>
+    <w:p>
+      <w:pPr>
+        <w:pStyle w:val="BodyText"/>
+      </w:pPr>
+      <w:r>
+        <w:t xml:space="preserve">And underneath both is a question this book has circled from the start without being able to ask it. These people have never spoken. They have never had a single word. They do have marks: shapes they make and see, which mean nothing at first, and which come, for some of them, to go with a person, or a place, or a thing worth making. If they are ever to speak, it will have to begin there, with a mark that one person makes and another understands, and that nobody wrote.</w:t>
+      </w:r>
+    </w:p>
+    <w:p>
+      <w:pPr>
+        <w:pStyle w:val="BodyText"/>
+      </w:pPr>
+      <w:r>
+        <w:t xml:space="preserve">That is where Part Two begins.</w:t>
+      </w:r>
+    </w:p>
+    <w:p>
+      <w:pPr>
+        <w:pStyle w:val="ChapterLabel"/>
+      </w:pPr>
+      <w:r>
+        <w:t xml:space="preserve">APPENDIX A</w:t>
+      </w:r>
+    </w:p>
+    <w:p>
+      <w:pPr>
+        <w:pStyle w:val="Heading1Plain"/>
+      </w:pPr>
+      <w:r>
+        <w:t xml:space="preserve">Timeline</w:t>
+      </w:r>
+      <w:r>
+        <w:fldChar w:fldCharType="begin"/>
+      </w:r>
+      <w:r>
+        <w:instrText xml:space="preserve"> TC "Appendix A: Timeline" \l 1 </w:instrText>
+      </w:r>
+      <w:r>
+        <w:fldChar w:fldCharType="end"/>
+      </w:r>
+    </w:p>
+    <w:p>
+      <w:pPr>
+        <w:pStyle w:val="BodyFirst"/>
+      </w:pPr>
+      <w:r>
+        <w:rPr>
+          <w:smallCaps/>
+        </w:rPr>
+        <w:t xml:space="preserve">Dates are as</w:t>
+      </w:r>
+      <w:r>
+        <w:t xml:space="preserve"> recorded in the repository. World Bible versions 1 to 6 are not preserved in the record.</w:t>
+      </w:r>
+    </w:p>
+    <w:p>
+      <w:pPr>
+        <w:pStyle w:val="ListBullet"/>
+      </w:pPr>
+      <w:r>
+        <w:rPr>
+          <w:b/>
+        </w:rPr>
+        <w:t xml:space="preserve">Before the record.</w:t>
+      </w:r>
+      <w:r>
+        <w:t xml:space="preserve"> The founding question; Bob; the rule that nature is programmed and culture written by nobody; World Bible versions up to 7.1.</w:t>
+      </w:r>
+    </w:p>
+    <w:p>
+      <w:pPr>
+        <w:pStyle w:val="ListBullet"/>
+      </w:pPr>
+      <w:r>
+        <w:rPr>
+          <w:b/>
+        </w:rPr>
+        <w:t xml:space="preserve">E0.</w:t>
+      </w:r>
+      <w:r>
+        <w:t xml:space="preserve"> A mind before civilization. Ten founders, 500 days. Frozen predictions begin.</w:t>
+      </w:r>
+    </w:p>
+    <w:p>
+      <w:pPr>
+        <w:pStyle w:val="ListBullet"/>
+      </w:pPr>
+      <w:r>
+        <w:rPr>
+          <w:b/>
+        </w:rPr>
+        <w:t xml:space="preserve">E1.</w:t>
+      </w:r>
+      <w:r>
+        <w:t xml:space="preserve"> The first long histories. Culture appears; the raft is invented and not used; trust follows food; Kaileir kills Ludol.</w:t>
+      </w:r>
+    </w:p>
+    <w:p>
+      <w:pPr>
+        <w:pStyle w:val="ListBullet"/>
+      </w:pPr>
+      <w:r>
+        <w:rPr>
+          <w:b/>
+        </w:rPr>
+        <w:t xml:space="preserve">2 October 2026 — E2.</w:t>
+      </w:r>
+      <w:r>
+        <w:t xml:space="preserve"> The four changes. Testing, reputation, records and floating work; population falls by 40%.</w:t>
+      </w:r>
+    </w:p>
+    <w:p>
+      <w:pPr>
+        <w:pStyle w:val="ListBullet"/>
+      </w:pPr>
+      <w:r>
+        <w:rPr>
+          <w:b/>
+        </w:rPr>
+        <w:t xml:space="preserve">E3.</w:t>
+      </w:r>
+      <w:r>
+        <w:t xml:space="preserve"> The missing births. Inconclusive.</w:t>
+      </w:r>
+    </w:p>
+    <w:p>
+      <w:pPr>
+        <w:pStyle w:val="ListBullet"/>
+      </w:pPr>
+      <w:r>
+        <w:rPr>
+          <w:b/>
+        </w:rPr>
+        <w:t xml:space="preserve">E4.</w:t>
+      </w:r>
+      <w:r>
+        <w:t xml:space="preserve"> Twenty-four worlds. The effect is real; the cause is isolation.</w:t>
+      </w:r>
+    </w:p>
+    <w:p>
+      <w:pPr>
+        <w:pStyle w:val="ListBullet"/>
+      </w:pPr>
+      <w:r>
+        <w:rPr>
+          <w:b/>
+        </w:rPr>
+        <w:t xml:space="preserve">E5.</w:t>
+      </w:r>
+      <w:r>
+        <w:t xml:space="preserve"> The millennium. Thousand-year traditions; two peoples who never met; the freeze.</w:t>
+      </w:r>
+    </w:p>
+    <w:p>
+      <w:pPr>
+        <w:pStyle w:val="ListBullet"/>
+      </w:pPr>
+      <w:r>
+        <w:rPr>
+          <w:b/>
+        </w:rPr>
+        <w:t xml:space="preserve">3 October 2026 — World Bible 8.1.</w:t>
+      </w:r>
+      <w:r>
+        <w:t xml:space="preserve"> Laws 121 to 125 written from the first runs; the method set down as M1 to M9.</w:t>
+      </w:r>
+    </w:p>
+    <w:p>
+      <w:pPr>
+        <w:pStyle w:val="ListBullet"/>
+      </w:pPr>
+      <w:r>
+        <w:rPr>
+          <w:b/>
+        </w:rPr>
+        <w:t xml:space="preserve">E6.</w:t>
+      </w:r>
+      <w:r>
+        <w:t xml:space="preserve"> Richer matter. Bottleneck remains.</w:t>
+      </w:r>
+    </w:p>
+    <w:p>
+      <w:pPr>
+        <w:pStyle w:val="ListBullet"/>
+      </w:pPr>
+      <w:r>
+        <w:rPr>
+          <w:b/>
+        </w:rPr>
+        <w:t xml:space="preserve">E6.5, E6.6.</w:t>
+      </w:r>
+      <w:r>
+        <w:t xml:space="preserve"> The autopsies. Beimak and Reibik; the interaction bottleneck; delayed learning shown to work.</w:t>
+      </w:r>
+    </w:p>
+    <w:p>
+      <w:pPr>
+        <w:pStyle w:val="ListBullet"/>
+      </w:pPr>
+      <w:r>
+        <w:rPr>
+          <w:b/>
+        </w:rPr>
+        <w:t xml:space="preserve">3 October 2026 — E7 designed and frozen.</w:t>
+      </w:r>
+    </w:p>
+    <w:p>
+      <w:pPr>
+        <w:pStyle w:val="ListBullet"/>
+      </w:pPr>
+      <w:r>
+        <w:rPr>
+          <w:b/>
+        </w:rPr>
+        <w:t xml:space="preserve">4 October 2026 — E7 audited, fixed and launched.</w:t>
+      </w:r>
+      <w:r>
+        <w:t xml:space="preserve"> Six problems fixed before any world ran.</w:t>
+      </w:r>
+    </w:p>
+    <w:p>
+      <w:pPr>
+        <w:pStyle w:val="ListBullet"/>
+      </w:pPr>
+      <w:r>
+        <w:rPr>
+          <w:b/>
+        </w:rPr>
+        <w:t xml:space="preserve">4 October 2026 — E7 results.</w:t>
+      </w:r>
+      <w:r>
+        <w:t xml:space="preserve"> Valid. Fire hardens clay hundreds of times; water almost never; bottleneck remains.</w:t>
+      </w:r>
+    </w:p>
+    <w:p>
+      <w:pPr>
+        <w:pStyle w:val="ListBullet"/>
+      </w:pPr>
+      <w:r>
+        <w:rPr>
+          <w:b/>
+        </w:rPr>
+        <w:t xml:space="preserve">4 October 2026 — E7.5.</w:t>
+      </w:r>
+      <w:r>
+        <w:t xml:space="preserve"> The year-115 novelty is a duller flint flake, made by unskilled people.</w:t>
+      </w:r>
+    </w:p>
+    <w:p>
+      <w:pPr>
+        <w:pStyle w:val="ListBullet"/>
+      </w:pPr>
+      <w:r>
+        <w:rPr>
+          <w:b/>
+        </w:rPr>
+        <w:t xml:space="preserve">4 October 2026 — E7.6 and E7.7 frozen and launched.</w:t>
+      </w:r>
+      <w:r>
+        <w:t xml:space="preserve"> The memory ceiling and the narrowness of watching found in the code.</w:t>
+      </w:r>
+    </w:p>
+    <w:p>
+      <w:pPr>
+        <w:pStyle w:val="ListBullet"/>
+      </w:pPr>
+      <w:r>
+        <w:rPr>
+          <w:b/>
+        </w:rPr>
+        <w:t xml:space="preserve">5 October 2026 — E7.6 and E7.7 results.</w:t>
+      </w:r>
+      <w:r>
+        <w:t xml:space="preserve"> Valid. Crafting skill collapses tenfold; deliberate making collapses fortyfold; recipes thin out 4- to 8-fold; watertight vessels never exist; watching produces only 7 copies in 1,770 observations; composite inventions face a 5x memory eviction penalty.</w:t>
+      </w:r>
+    </w:p>
+    <w:p>
+      <w:pPr>
+        <w:pStyle w:val="ListBullet"/>
+      </w:pPr>
+      <w:r>
+        <w:rPr>
+          <w:b/>
+        </w:rPr>
+        <w:t xml:space="preserve">5 October 2026 — E8 (The Crucible) designed and frozen.</w:t>
+      </w:r>
+      <w:r>
+        <w:t xml:space="preserve"> Testing four orthogonal arms against the degenerative loop: making freedom, scaffolded apprenticeship, composite memory protection, and demographic scale.</w:t>
+      </w:r>
+    </w:p>
+    <w:p>
+      <w:pPr>
+        <w:pStyle w:val="ListBullet"/>
+      </w:pPr>
+      <w:r>
+        <w:rPr>
+          <w:b/>
+        </w:rPr>
+        <w:t xml:space="preserve">5 October 2026 — E8 amendment 1.</w:t>
+      </w:r>
+      <w:r>
+        <w:t xml:space="preserve"> Review finds an impossible criterion, a confounded arm and a self-contradiction; one arm is to run first.</w:t>
+      </w:r>
+    </w:p>
+    <w:p>
+      <w:pPr>
+        <w:pStyle w:val="ListBullet"/>
+      </w:pPr>
+      <w:r>
+        <w:rPr>
+          <w:b/>
+        </w:rPr>
+        <w:t xml:space="preserve">5 October 2026 — E8 Arm 1.</w:t>
+      </w:r>
+      <w:r>
+        <w:t xml:space="preserve"> Freeing people to remake what they hold does not free making. No evidence it helps.</w:t>
+      </w:r>
+    </w:p>
+    <w:p>
+      <w:pPr>
+        <w:pStyle w:val="ListBullet"/>
+      </w:pPr>
+      <w:r>
+        <w:rPr>
+          <w:b/>
+        </w:rPr>
+        <w:t xml:space="preserve">5 October 2026 — E8.1.</w:t>
+      </w:r>
+      <w:r>
+        <w:t xml:space="preserve"> Making was never competitive, even for the founders; by the third generation it is weighed less than one week in a hundred and fifty.</w:t>
+      </w:r>
+    </w:p>
+    <w:p>
+      <w:pPr>
+        <w:pStyle w:val="ListBullet"/>
+      </w:pPr>
+      <w:r>
+        <w:rPr>
+          <w:b/>
+        </w:rPr>
+        <w:t xml:space="preserve">5 October 2026 — E8.2.</w:t>
+      </w:r>
+      <w:r>
+        <w:t xml:space="preserve"> Tools add at most 2% of food foraged. The world gives almost no reason to make anything.</w:t>
+      </w:r>
+    </w:p>
+    <w:p>
+      <w:pPr>
+        <w:pStyle w:val="ListBullet"/>
+      </w:pPr>
+      <w:r>
+        <w:rPr>
+          <w:b/>
+        </w:rPr>
+        <w:t xml:space="preserve">5 October 2026 — E8.3.</w:t>
+      </w:r>
+      <w:r>
+        <w:t xml:space="preserve"> 88% of starvation deaths come in winter or early spring; the dead had laid nothing by; not one carried a container.</w:t>
+      </w:r>
+    </w:p>
+    <w:p>
+      <w:pPr>
+        <w:pStyle w:val="ListBullet"/>
+      </w:pPr>
+      <w:r>
+        <w:rPr>
+          <w:b/>
+        </w:rPr>
+        <w:t xml:space="preserve">5 October 2026 — E8.4.</w:t>
+      </w:r>
+      <w:r>
+        <w:t xml:space="preserve"> Autumn offers a median surplus of 163 beyond its own needs; the median adult enters winter with 13. The world allows preparation; nobody prepares.</w:t>
+      </w:r>
+    </w:p>
+    <w:p>
+      <w:pPr>
+        <w:pStyle w:val="ListBullet"/>
+      </w:pPr>
+      <w:r>
+        <w:rPr>
+          <w:b/>
+        </w:rPr>
+        <w:t xml:space="preserve">5 October 2026 — E9.</w:t>
+      </w:r>
+      <w:r>
+        <w:t xml:space="preserve"> Anticipation built from experience, at two pre-stated strengths. Leak test passed; central test failed; for the first time, people fill their hands before winter.</w:t>
+      </w:r>
+    </w:p>
+    <w:p>
+      <w:pPr>
+        <w:pStyle w:val="ListBullet"/>
+      </w:pPr>
+      <w:r>
+        <w:rPr>
+          <w:b/>
+        </w:rPr>
+        <w:t xml:space="preserve">5–6 October 2026 — E9.1.</w:t>
+      </w:r>
+      <w:r>
+        <w:t xml:space="preserve"> The lesson reaches nearly everyone, faintly; only the few who learned it strongly store food.</w:t>
+      </w:r>
+    </w:p>
+    <w:p>
+      <w:pPr>
+        <w:pStyle w:val="ListBullet"/>
+      </w:pPr>
+      <w:r>
+        <w:rPr>
+          <w:b/>
+        </w:rPr>
+        <w:t xml:space="preserve">6 October 2026 — E9.2.</w:t>
+      </w:r>
+      <w:r>
+        <w:t xml:space="preserve"> A carer's food at the start of winter cuts their children's risk of starving five-fold.</w:t>
+      </w:r>
+    </w:p>
+    <w:p>
+      <w:pPr>
+        <w:pStyle w:val="ListBullet"/>
+      </w:pPr>
+      <w:r>
+        <w:rPr>
+          <w:b/>
+        </w:rPr>
+        <w:t xml:space="preserve">6 October 2026 — E10.</w:t>
+      </w:r>
+      <w:r>
+        <w:t xml:space="preserve"> The lesson of a lost child and of a witnessed death, at two witness strengths. Leak test passed; the bereaved forage a little more; no one enters winter with more food.</w:t>
+      </w:r>
+    </w:p>
+    <w:p>
+      <w:pPr>
+        <w:pStyle w:val="ListBullet"/>
+      </w:pPr>
+      <w:r>
+        <w:rPr>
+          <w:b/>
+        </w:rPr>
+        <w:t xml:space="preserve">6 October 2026 — E9.3.</w:t>
+      </w:r>
+      <w:r>
+        <w:t xml:space="preserve"> The first winter planners: ordinary people with a hard lesson; their stores shared and used up; one in 113 plans again.</w:t>
+      </w:r>
+    </w:p>
+    <w:p>
+      <w:pPr>
+        <w:pStyle w:val="ListBullet"/>
+      </w:pPr>
+      <w:r>
+        <w:rPr>
+          <w:b/>
+        </w:rPr>
+        <w:t xml:space="preserve">6 October 2026 — E9.4.</w:t>
+      </w:r>
+      <w:r>
+        <w:t xml:space="preserve"> The self-erasing lesson measured: preparing is a threshold behaviour, and a successful winter drops the lesson below it.</w:t>
+      </w:r>
+    </w:p>
+    <w:p>
+      <w:pPr>
+        <w:pStyle w:val="ListBullet"/>
+      </w:pPr>
+      <w:r>
+        <w:rPr>
+          <w:b/>
+        </w:rPr>
+        <w:t xml:space="preserve">6 October 2026 — E11.</w:t>
+      </w:r>
+      <w:r>
+        <w:t xml:space="preserve"> Stories of hunger deaths carry cause and season to forty thousand hearers, and move each of them very little.</w:t>
+      </w:r>
+    </w:p>
+    <w:p>
+      <w:pPr>
+        <w:pStyle w:val="ListBullet"/>
+      </w:pPr>
+      <w:r>
+        <w:rPr>
+          <w:b/>
+        </w:rPr>
+        <w:t xml:space="preserve">6 October 2026 — E12.</w:t>
+      </w:r>
+      <w:r>
+        <w:t xml:space="preserve"> The planners were visible, generous and respected, and nobody around them changed: no one in ACL can copy what a neighbour does.</w:t>
+      </w:r>
+    </w:p>
+    <w:p>
+      <w:pPr>
+        <w:pStyle w:val="ListBullet"/>
+      </w:pPr>
+      <w:r>
+        <w:rPr>
+          <w:b/>
+        </w:rPr>
+        <w:t xml:space="preserve">6 October 2026 — E13.</w:t>
+      </w:r>
+      <w:r>
+        <w:t xml:space="preserve"> People learn from the foraging of the visibly well fed. Planners fourfold, repeat planning 6.3% against 0.9%; declared failed by its own rule, because its leak test had no one in it to measure.</w:t>
+      </w:r>
+    </w:p>
+    <w:p>
+      <w:pPr>
+        <w:pStyle w:val="ListBullet"/>
+      </w:pPr>
+      <w:r>
+        <w:rPr>
+          <w:b/>
+        </w:rPr>
+        <w:t xml:space="preserve">October 2026 — E13R.</w:t>
+      </w:r>
+      <w:r>
+        <w:t xml:space="preserve"> Sixteen new worlds, a sham arm and an instrumented check: the copying acts only through the watcher's habit. Headline failed (5.6% against 4.3%); planners 2.9×, carers +8.3 points; neighbours unchanged, children not saved. Copying passes a foraging habit, learned from anyone better fed, not a plan.</w:t>
+      </w:r>
+    </w:p>
+    <w:p>
+      <w:pPr>
+        <w:pStyle w:val="ListBullet"/>
+      </w:pPr>
+      <w:r>
+        <w:rPr>
+          <w:b/>
+        </w:rPr>
+        <w:t xml:space="preserve">October 2026 — E13R autopsy.</w:t>
+      </w:r>
+      <w:r>
+        <w:t xml:space="preserve"> Stocked carers still protect children five- to tenfold, but at every level of a carer's food, children in the copying worlds starved more. The copied habit is year-round, not autumn; people go into winter with more food and end it with none. Copying did not help winter.</w:t>
+      </w:r>
+    </w:p>
+    <w:p>
+      <w:pPr>
+        <w:pStyle w:val="ListBullet"/>
+      </w:pPr>
+      <w:r>
+        <w:rPr>
+          <w:b/>
+        </w:rPr>
+        <w:t xml:space="preserve">October 2026 — W1, the winter ledger.</w:t>
+      </w:r>
+      <w:r>
+        <w:t xml:space="preserve"> The creator changes the roadmap's branch after the autopsy. Winter is lived hand to mouth: gathering in winter covers 102% of winter eating, stock at its start 14%. The median family holds a ninth of its winter; stashes are almost unused. Not keeping food: nobody puts any away.</w:t>
+      </w:r>
+    </w:p>
+    <w:p>
+      <w:pPr>
+        <w:pStyle w:val="ListBullet"/>
+      </w:pPr>
+      <w:r>
+        <w:rPr>
+          <w:b/>
+        </w:rPr>
+        <w:t xml:space="preserve">October 2026 — S1.</w:t>
+      </w:r>
+      <w:r>
+        <w:t xml:space="preserve"> The decision to stash, mapped. Three gates: rarely eligible (13% of adult-weeks, 2.7% in autumn), often displaced by materials, usually outscored, mostly by giving (39%) and other social actions; foraging wins only 4%. Stashers learn it kept food better than carrying it; the belief spreads; belief is not what is missing.</w:t>
+      </w:r>
+    </w:p>
+    <w:p>
+      <w:pPr>
+        <w:pStyle w:val="ListBullet"/>
+      </w:pPr>
+      <w:r>
+        <w:rPr>
+          <w:b/>
+        </w:rPr>
+        <w:t xml:space="preserve">October 2026 — G1.</w:t>
+      </w:r>
+      <w:r>
+        <w:t xml:space="preserve"> Who receives the food. 72% of gifts go to family, a third to siblings (in every world); 63% to people with under half a week of food; half is repayment; strangers receive almost nothing. A family's surplus is kept in its members' stomachs and debts, not in a store.</w:t>
+      </w:r>
+    </w:p>
+    <w:p>
+      <w:pPr>
+        <w:pStyle w:val="ListBullet"/>
+      </w:pPr>
+      <w:r>
+        <w:rPr>
+          <w:b/>
+        </w:rPr>
+        <w:t xml:space="preserve">October 2026 — P1.</w:t>
+      </w:r>
+      <w:r>
+        <w:t xml:space="preserve"> Risk pooling or spreading scarcity. Family food protects the poorest strongly (winter starvation 25 times lower with a well-stocked family); people rarely starve amid plenty; giving does not leave givers hungry. But help follows only one hungry week in ten, families hold a ninth of their winter, and more sharing brings no better winters. A pool with almost nothing in it.</w:t>
+      </w:r>
+    </w:p>
+    <w:p>
+      <w:pPr>
+        <w:pStyle w:val="ListBullet"/>
+      </w:pPr>
+      <w:r>
+        <w:rPr>
+          <w:b/>
+        </w:rPr>
+        <w:t xml:space="preserve">October 2026 — U1.</w:t>
+      </w:r>
+      <w:r>
+        <w:t xml:space="preserve"> E8.4 revisited. The food is on the land and barely touched; autumn is foraged like any season; the carrying limit is never reached. People stop when fed: foraging falls from 86% of autumn weeks with under half a week of food to 6% with two to four weeks. In the code, hunger reaches zero at two weeks, exactly where stashing becomes possible.</w:t>
+      </w:r>
+    </w:p>
+    <w:p>
+      <w:pPr>
+        <w:pStyle w:val="ListBullet"/>
+      </w:pPr>
+      <w:r>
+        <w:rPr>
+          <w:b/>
+        </w:rPr>
+        <w:t xml:space="preserve">October 2026 — N1.</w:t>
+      </w:r>
+      <w:r>
+        <w:t xml:space="preserve"> No code, no experiment: thirteen readings of what a satisfied person should feel, judged for nature, culture, scripting, human capacity and leak. A seasonal instinct and food-as-standing rejected; smooth satiety, insecurity learned from experience, the body as a store, and a longer mind stand out. The creator chooses.</w:t>
+      </w:r>
+    </w:p>
+    <w:p>
+      <w:pPr>
+        <w:pStyle w:val="ListBullet"/>
+      </w:pPr>
+      <w:r>
+        <w:rPr>
+          <w:b/>
+        </w:rPr>
+        <w:t xml:space="preserve">October 2026 — N1, the evidence.</w:t>
+      </w:r>
+      <w:r>
+        <w:t xml:space="preserve"> The human evidence behind four candidates checked against its sources: strong for the body as a store, strong for foresight as a capacity but weak for its use, mixed for learned worry, general for smooth satisfaction. Woodburn's immediate-return societies store little despite full foresight. The least change that answers U1 is smooth satisfaction confined to the pull to gather; changing nothing stays on the table.</w:t>
+      </w:r>
+    </w:p>
+    <w:p>
+      <w:pPr>
+        <w:pStyle w:val="ListBullet"/>
+      </w:pPr>
+      <w:r>
+        <w:rPr>
+          <w:b/>
+        </w:rPr>
+        <w:t xml:space="preserve">October 2026 — N2 and D1.</w:t>
+      </w:r>
+      <w:r>
+        <w:t xml:space="preserve"> The question reframed (ACL may live as an immediate-return society, not a broken one), then tested on the world itself. Food is predictable and storable as seed but thin, and winter leaves the land seven-eighths as full as autumn. Sowing already returns more than twice its seed, yet half its crop feeds others and sowers mostly come away believing it failed. By the creator's rule, changing people's psychology is premature.</w:t>
+      </w:r>
+    </w:p>
+    <w:p>
+      <w:pPr>
+        <w:pStyle w:val="ListBullet"/>
+      </w:pPr>
+      <w:r>
+        <w:rPr>
+          <w:b/>
+        </w:rPr>
+        <w:t xml:space="preserve">October 2026 — D2.</w:t>
+      </w:r>
+      <w:r>
+        <w:t xml:space="preserve"> Why sowers seemed to learn failure. They do not: D1's measure counted forgetting as failure (corrected). Sowers learn that sowing works, but the return is not theirs: the sower's family gets back about what it sowed, others harvest more, and autumn sowing is a loss to the family. Sowing explains part of the absence of delayed return; the lean season and property remain open.</w:t>
+      </w:r>
+    </w:p>
+    <w:p>
+      <w:pPr>
+        <w:pStyle w:val="ListBullet"/>
+      </w:pPr>
+      <w:r>
+        <w:rPr>
+          <w:b/>
+        </w:rPr>
+        <w:t xml:space="preserve">October 2026 — N3.</w:t>
+      </w:r>
+      <w:r>
+        <w:t xml:space="preserve"> Nine readings of a harder lean season, then the evidence: temperate plants are dormant in winter, so zero winter growth is the realistic value; lean seasons vary with climate; foragers meet them with meat, weight loss, movement and storage. The first test chosen: winter growth set to zero, nothing else changed.</w:t>
+      </w:r>
+    </w:p>
+    <w:p>
+      <w:pPr>
+        <w:pStyle w:val="ListBullet"/>
+      </w:pPr>
+      <w:r>
+        <w:rPr>
+          <w:b/>
+        </w:rPr>
+        <w:t xml:space="preserve">October 2026 — L1 frozen, and stopped.</w:t>
+      </w:r>
+      <w:r>
+        <w:t xml:space="preserve"> The survival pilot's rule was triggered (two of four worlds died out) and the experiment did not run. A declared, survival-only check of the same seeds without the change found one world fragile anyway, one killed by the leaner winter, and every surviving leaner world much smaller. The creator chose to redesign the pilot with same-seed controls.</w:t>
+      </w:r>
+    </w:p>
+    <w:p>
+      <w:pPr>
+        <w:pStyle w:val="ListBullet"/>
+      </w:pPr>
+      <w:r>
+        <w:rPr>
+          <w:b/>
+        </w:rPr>
+        <w:t xml:space="preserve">October 2026 — L1 run.</w:t>
+      </w:r>
+      <w:r>
+        <w:t xml:space="preserve"> The redesigned pilot passed (the unchanged worlds died out more often than the leaner ones). The experiment ran as frozen: its manipulation check failed, because the leaner worlds ended with far fewer people and so as much winter food each (a design flaw, admitted: food was measured per person, not per tile). By the frozen rule, a null that says nothing about lean seasons. Observed: a steady lean season is absorbed by density, not by storing.</w:t>
+      </w:r>
+    </w:p>
+    <w:p>
+      <w:pPr>
+        <w:pStyle w:val="ListBullet"/>
+      </w:pPr>
+      <w:r>
+        <w:rPr>
+          <w:b/>
+        </w:rPr>
+        <w:t xml:space="preserve">October 2026 — H-L5, N4 and V1 (overnight).</w:t>
+      </w:r>
+      <w:r>
+        <w:t xml:space="preserve"> The creator's hypothesis that delayed return answers uncertainty, not average scarcity. Candidates for unpredictable winters; evidence that sharing insures only what is not common to the whole group, and that real grassland production varies about a third from year to year against ACL's fourteenth; and a read-only study of ACL's own bad years: deadly, but not teaching storage. A design comparing world-wide with patchy bad years drafted for sign-off.</w:t>
+      </w:r>
+    </w:p>
+    <w:p>
+      <w:pPr>
+        <w:pStyle w:val="ListBullet"/>
+      </w:pPr>
+      <w:r>
+        <w:rPr>
+          <w:b/>
+        </w:rPr>
+        <w:t xml:space="preserve">October 2026 — U stopped at the pilot.</w:t>
+      </w:r>
+      <w:r>
+        <w:t xml:space="preserve"> Signed off for a grassland target. ACL's land smoothed even the widest weather to about 11% variation in food a year (grassland about 37%); at that width the pilot lost 7 and 6 of 8 worlds against the control's 4, with no seed keeping all three arms alive. Hard stop; no behaviour measured; the design returns to the creator.</w:t>
+      </w:r>
+    </w:p>
+    <w:p>
+      <w:pPr>
+        <w:pStyle w:val="ListBullet"/>
+      </w:pPr>
+      <w:r>
+        <w:rPr>
+          <w:b/>
+        </w:rPr>
+        <w:t xml:space="preserve">October 2026 — Rules 12 to 19.</w:t>
+      </w:r>
+      <w:r>
+        <w:t xml:space="preserve"> During the fragility study (F1), eight rules added to the eleven, each paid for by a failure: feasibility before design; manipulation checks anchored to the target; baseline survival first; discovery confirmed on a holdout; every number traceable; nature anchored, not tuned; population beside every measure; corrections appended, not rewritten.</w:t>
+      </w:r>
+    </w:p>
+    <w:p>
+      <w:pPr>
+        <w:pStyle w:val="ListBullet"/>
+      </w:pPr>
+      <w:r>
+        <w:rPr>
+          <w:b/>
+        </w:rPr>
+        <w:t xml:space="preserve">October 2026 — F1, baseline fragility.</w:t>
+      </w:r>
+      <w:r>
+        <w:t xml:space="preserve"> A third of control worlds die out (22 of 64), not from hunger: births stop forty to sixty-five years before the end and the people age out. After the founders people rarely pair, because in a small, scattered people a partner is almost never within sight. Dying worlds can be told apart by their size at year twenty. Read-only; confirmed on 24 new worlds.</w:t>
+      </w:r>
+    </w:p>
+    <w:p>
+      <w:pPr>
+        <w:pStyle w:val="ListBullet"/>
+      </w:pPr>
+      <w:r>
+        <w:rPr>
+          <w:b/>
+        </w:rPr>
+        <w:t xml:space="preserve">October 2026 — Stage 0 reopened; N5.</w:t>
+      </w:r>
+      <w:r>
+        <w:t xml:space="preserve"> The creator reopens the world's foundation. Evidence: real foragers find spouses in networks of hundreds, outside the local group, mostly through kin; a viable people needs some 75 to 150 members even with perfect search. ACL's whole world held twenty, searching within sight. Nothing changed; a feasibility question set for the creator.</w:t>
+      </w:r>
+    </w:p>
+    <w:p>
+      <w:pPr>
+        <w:pStyle w:val="ListBullet"/>
+      </w:pPr>
+      <w:r>
+        <w:rPr>
+          <w:b/>
+        </w:rPr>
+        <w:t xml:space="preserve">October 2026 — F2.</w:t>
+      </w:r>
+      <w:r>
+        <w:t xml:space="preserve"> Perfect partner finding, as a diagnostic on the same 64 worlds: 7 died out against 22, verdict "both". Search was most of the problem; the worlds that still died had no eligible partner left anywhere. Once people paired, couples drifted apart and larger peoples met the limit of their food.</w:t>
+      </w:r>
+    </w:p>
+    <w:p>
+      <w:pPr>
+        <w:pStyle w:val="ListBullet"/>
+      </w:pPr>
+      <w:r>
+        <w:rPr>
+          <w:b/>
+        </w:rPr>
+        <w:t xml:space="preserve">October 2026 — C1.</w:t>
+      </w:r>
+      <w:r>
+        <w:t xml:space="preserve"> Why couples drift apart, read-only and confirmed on new worlds: they are apart about half their weeks; two in five of those weeks sit in a gap between two thresholds written separately in the code; foraging splits them and food outbids the pull back. F2's figure on couples apart corrected.</w:t>
+      </w:r>
+    </w:p>
+    <w:p>
+      <w:pPr>
+        <w:pStyle w:val="ListBullet"/>
+      </w:pPr>
+      <w:r>
+        <w:rPr>
+          <w:b/>
+        </w:rPr>
+        <w:t xml:space="preserve">October 2026 — N6.</w:t>
+      </w:r>
+      <w:r>
+        <w:t xml:space="preserve"> How real forager couples live together: apart by day, often, but in the same camp at night. At ACL's weekly step a real couple would be together almost every week; ACL's couples share no home. Candidates set out for the creator; none chosen.</w:t>
+      </w:r>
+    </w:p>
+    <w:p>
+      <w:pPr>
+        <w:pStyle w:val="ListBullet"/>
+      </w:pPr>
+      <w:r>
+        <w:rPr>
+          <w:b/>
+        </w:rPr>
+        <w:t xml:space="preserve">October 2026 — H1.</w:t>
+      </w:r>
+      <w:r>
+        <w:t xml:space="preserve"> How far apart partners' homes lie, read-only: close in only half of couple-weeks, and changing every five or six weeks. Mixed by the frozen rule; a shared home, not only aligned thresholds, is what the evidence points to.</w:t>
+      </w:r>
+    </w:p>
+    <w:p>
+      <w:pPr>
+        <w:pStyle w:val="ListBullet"/>
+      </w:pPr>
+      <w:r>
+        <w:rPr>
+          <w:b/>
+        </w:rPr>
+        <w:t xml:space="preserve">October 2026 — T1.</w:t>
+      </w:r>
+      <w:r>
+        <w:t xml:space="preserve"> The pull toward a partner moved to where conception stops. The manipulation check failed: the pull was there and food outbid it; the outcome was not read. A slight change flipped the fate of 19 of 64 worlds: differences of a few worlds are noise.</w:t>
+      </w:r>
+    </w:p>
+    <w:p>
+      <w:pPr>
+        <w:pStyle w:val="ListBullet"/>
+      </w:pPr>
+      <w:r>
+        <w:rPr>
+          <w:b/>
+        </w:rPr>
+        <w:t xml:space="preserve">October 2026 — HB1.</w:t>
+      </w:r>
+      <w:r>
+        <w:t xml:space="preserve"> A shared home base, with a sham arm. Couples were together almost every week and had more children, but extinction rose (33 of 64 against 22; the sham, 24): families ate the land around homes that did not move with the food. (Not confirmed by HF1; see below.)</w:t>
+      </w:r>
+    </w:p>
+    <w:p>
+      <w:pPr>
+        <w:pStyle w:val="ListBullet"/>
+      </w:pPr>
+      <w:r>
+        <w:rPr>
+          <w:b/>
+        </w:rPr>
+        <w:t xml:space="preserve">October 2026 — HF1.</w:t>
+      </w:r>
+      <w:r>
+        <w:t xml:space="preserve"> The land around HB1's homes measured directly: only about 3% emptier than in the control, on old and new worlds alike. Depletion not confirmed; HB1's hunger has another cause, and the moving home waits.</w:t>
+      </w:r>
+    </w:p>
+    <w:p>
+      <w:pPr>
+        <w:pStyle w:val="ListBullet"/>
+      </w:pPr>
+      <w:r>
+        <w:rPr>
+          <w:b/>
+        </w:rPr>
+        <w:t xml:space="preserve">October 2026 — HF2.</w:t>
+      </w:r>
+      <w:r>
+        <w:t xml:space="preserve"> The household accounts of HB1's hunger: not too many children, not meat. People gave each other about two fifths less food, seen in the first worlds and again in new ones; consistent, not yet confirmed.</w:t>
+      </w:r>
+    </w:p>
+    <w:p>
+      <w:pPr>
+        <w:pStyle w:val="ListBullet"/>
+      </w:pPr>
+      <w:r>
+        <w:rPr>
+          <w:b/>
+        </w:rPr>
+        <w:t xml:space="preserve">October 2026 — HF3.</w:t>
+      </w:r>
+      <w:r>
+        <w:t xml:space="preserve"> The lost gifts did not explain HB1's hunger: help was within reach as often as before, and came less often. After three read-only checks, the hunger is real and unexplained by any single cause tested.</w:t>
+      </w:r>
+    </w:p>
+    <w:p>
+      <w:pPr>
+        <w:pStyle w:val="ListBullet"/>
+      </w:pPr>
+      <w:r>
+        <w:rPr>
+          <w:b/>
+        </w:rPr>
+        <w:t xml:space="preserve">October 2026 — HF4.</w:t>
+      </w:r>
+      <w:r>
+        <w:t xml:space="preserve"> A ledger of the moment of eating: the food people held fell about a fifteenth across the board; by the frozen rule, small shifts explained the hunger, though only about half of the extra starvation. The HB1 question closed; back to keeping couples together another way.</w:t>
+      </w:r>
+    </w:p>
+    <w:p>
+      <w:pPr>
+        <w:pStyle w:val="ListBullet"/>
+      </w:pPr>
+      <w:r>
+        <w:rPr>
+          <w:b/>
+        </w:rPr>
+        <w:t xml:space="preserve">October 2026 — N7.</w:t>
+      </w:r>
+      <w:r>
+        <w:t xml:space="preserve"> Candidates for keeping couples together, then evidence: foragers return to a camp each day and move it when the land around it gives less. A camp that goes where the couple goes is anchored; counting a day's walk as one camp is dropped.</w:t>
+      </w:r>
+    </w:p>
+    <w:p>
+      <w:pPr>
+        <w:pStyle w:val="ListBullet"/>
+      </w:pPr>
+      <w:r>
+        <w:rPr>
+          <w:b/>
+        </w:rPr>
+        <w:t xml:space="preserve">October 2026 — MC1.</w:t>
+      </w:r>
+      <w:r>
+        <w:t xml:space="preserve"> A camp that goes where the couple goes: couples together most weeks, more children, no extra hunger; extinction unchanged within the noise. Pair stability limited births, not survival.</w:t>
+      </w:r>
+    </w:p>
+    <w:p>
+      <w:pPr>
+        <w:pStyle w:val="ListBullet"/>
+      </w:pPr>
+      <w:r>
+        <w:rPr>
+          <w:b/>
+        </w:rPr>
+        <w:t xml:space="preserve">October 2026 — N8.</w:t>
+      </w:r>
+      <w:r>
+        <w:t xml:space="preserve"> How many worlds a test needs (half of perfect finding's effect: about 256), and the evidence for two ways of finding partners: remembering where acquaintances are, not shown; leaving when there is no one, attested, in a form that needs no chosen number.</w:t>
+      </w:r>
+    </w:p>
+    <w:p>
+      <w:pPr>
+        <w:pStyle w:val="ListBullet"/>
+      </w:pPr>
+      <w:r>
+        <w:rPr>
+          <w:b/>
+        </w:rPr>
+        <w:t xml:space="preserve">October 2026 — MC1-L.</w:t>
+      </w:r>
+      <w:r>
+        <w:t xml:space="preserve"> The moving camp re-tested on 256 new worlds: couples together, more children, extinction unchanged (93 against 87); any benefit smaller than half of perfect finding's. Genuinely weak, by the rule written beforehand.</w:t>
+      </w:r>
+    </w:p>
+    <w:p>
+      <w:pPr>
+        <w:pStyle w:val="ListBullet"/>
+      </w:pPr>
+      <w:r>
+        <w:rPr>
+          <w:b/>
+        </w:rPr>
+        <w:t xml:space="preserve">October 2026 — P2.</w:t>
+      </w:r>
+      <w:r>
+        <w:t xml:space="preserve"> Single people with no one in sight would step outward instead of at random. Stopped at its pilot: they almost never had anyone in sight, but they chose to search so seldom (about four weeks in a hundred) that the change barely acted. The question became how much people search, not where.</w:t>
+      </w:r>
+    </w:p>
+    <w:p>
+      <w:pPr>
+        <w:pStyle w:val="ListBullet"/>
+      </w:pPr>
+      <w:r>
+        <w:rPr>
+          <w:b/>
+        </w:rPr>
+        <w:t xml:space="preserve">October 2026 — N9.</w:t>
+      </w:r>
+      <w:r>
+        <w:t xml:space="preserve"> How much the unpartnered search: foragers visit and move often, by every account, but no source read says how often a person goes. No number could be set; the outward step was closed in its present form.</w:t>
+      </w:r>
+    </w:p>
+    <w:p>
+      <w:pPr>
+        <w:pStyle w:val="ListBullet"/>
+      </w:pPr>
+      <w:r>
+        <w:rPr>
+          <w:b/>
+        </w:rPr>
+        <w:t xml:space="preserve">October 2026 — GF1.</w:t>
+      </w:r>
+      <w:r>
+        <w:t xml:space="preserve"> How fluid ACL's groups are: adults living together are still together two years later 78 times in 100, in both discovery and holdout. Forager bands keep their people for months, not years; ACL's keep them for years.</w:t>
+      </w:r>
+    </w:p>
+    <w:p>
+      <w:pPr>
+        <w:pStyle w:val="ListBullet"/>
+      </w:pPr>
+      <w:r>
+        <w:rPr>
+          <w:b/>
+        </w:rPr>
+        <w:t xml:space="preserve">October 2026 — N10.</w:t>
+      </w:r>
+      <w:r>
+        <w:t xml:space="preserve"> Is the world too small? In people, yes: a viable forager people needs 75–150 or more and real ones average about 840; ACL's twenty make a single band. Land alone was not the shortage.</w:t>
+      </w:r>
+    </w:p>
+    <w:p>
+      <w:pPr>
+        <w:pStyle w:val="ListBullet"/>
+      </w:pPr>
+      <w:r>
+        <w:rPr>
+          <w:b/>
+        </w:rPr>
+        <w:t xml:space="preserve">October 2026 — WS1.</w:t>
+      </w:r>
+      <w:r>
+        <w:t xml:space="preserve"> More land, or more people? On 256 new worlds, four times the land changed nothing (108 died out against 107); eighty founders instead of twenty did: 2 died out on the large land, 23 on today's. Not land, but people. Larger founding bands came with them, so the two are not yet separated.</w:t>
+      </w:r>
+    </w:p>
+    <w:p>
+      <w:pPr>
+        <w:pStyle w:val="ListBullet"/>
+      </w:pPr>
+      <w:r>
+        <w:rPr>
+          <w:b/>
+        </w:rPr>
+        <w:t xml:space="preserve">October 2026 — AA1.</w:t>
+      </w:r>
+      <w:r>
+        <w:t xml:space="preserve"> Do the people lean on flaws in the world? One true flaw, local: a hidden land bridge across water at a corner, in about one world in three. And knowledge nobody gave them: people walk toward where an absent loved one is right now (3 in 10 journeys to join someone), and half of all partner searches aim at someone out of sight. Nothing fixed; the creator decides.</w:t>
+      </w:r>
+    </w:p>
+    <w:p>
+      <w:pPr>
+        <w:pStyle w:val="ListBullet"/>
+      </w:pPr>
+      <w:r>
+        <w:rPr>
+          <w:b/>
+        </w:rPr>
+        <w:t xml:space="preserve">October 2026 — LK1.</w:t>
+      </w:r>
+      <w:r>
+        <w:t xml:space="preserve"> The first shortcut taken away: people walked to where they last saw an absent loved one, not to where that person was. Families spent more time apart; partner finding, births and survival did not change (87 worlds died out against 90). The gift held families together, not worlds.</w:t>
+      </w:r>
+    </w:p>
+    <w:p>
+      <w:pPr>
+        <w:pStyle w:val="ListBullet"/>
+      </w:pPr>
+      <w:r>
+        <w:rPr>
+          <w:b/>
+        </w:rPr>
+        <w:t xml:space="preserve">October 2026 — SA1.</w:t>
+      </w:r>
+      <w:r>
+        <w:t xml:space="preserve"> Six hand-chosen numbers, each halved and doubled. How far people see decided the most: at half their sight 49 of 64 worlds died, at double 8 (22 as they are). Every finding about extinction now rests on a number nobody anchored. None was changed.</w:t>
+      </w:r>
+    </w:p>
+    <w:p>
+      <w:pPr>
+        <w:pStyle w:val="ListBullet"/>
+      </w:pPr>
+      <w:r>
+        <w:rPr>
+          <w:b/>
+        </w:rPr>
+        <w:t xml:space="preserve">October 2026 — MB1a.</w:t>
+      </w:r>
+      <w:r>
+        <w:t xml:space="preserve"> Do the bands meet? In today's worlds, right at the line, with no verdict; with eighty founders on the same land, rarely; on four times the land, almost never, and those worlds survived best. Band size, not meeting, carried them.</w:t>
+      </w:r>
+    </w:p>
+    <w:p>
+      <w:pPr>
+        <w:pStyle w:val="ListBullet"/>
+      </w:pPr>
+      <w:r>
+        <w:rPr>
+          <w:b/>
+        </w:rPr>
+        <w:t xml:space="preserve">October 2026 — BL0.</w:t>
+      </w:r>
+      <w:r>
+        <w:t xml:space="preserve"> Do their habits matter, and whose are they? They steer one grown person's choice in seven; but more than half of them is copied whole in conversation, a third is the person's own learning, and everyone ends up nearly alike.</w:t>
+      </w:r>
+    </w:p>
+    <w:p>
+      <w:pPr>
+        <w:pStyle w:val="ListBullet"/>
+      </w:pPr>
+      <w:r>
+        <w:rPr>
+          <w:b/>
+        </w:rPr>
+        <w:t xml:space="preserve">October 2026 — ID1.</w:t>
+      </w:r>
+      <w:r>
+        <w:t xml:space="preserve"> What makes a person who they are? Swapping any one part (habits, memories, beliefs, temperament) changed people no more than chance; everything but temperament together did. Whether they became the other person, and whether they came back, was left unanswered.</w:t>
+      </w:r>
+    </w:p>
+    <w:p>
+      <w:pPr>
+        <w:pStyle w:val="ChapterLabel"/>
+      </w:pPr>
+      <w:r>
+        <w:t xml:space="preserve">APPENDIX B</w:t>
+      </w:r>
+    </w:p>
+    <w:p>
+      <w:pPr>
+        <w:pStyle w:val="Heading1Plain"/>
+      </w:pPr>
+      <w:r>
+        <w:t xml:space="preserve">Words Used in This Book</w:t>
+      </w:r>
+      <w:r>
+        <w:fldChar w:fldCharType="begin"/>
+      </w:r>
+      <w:r>
+        <w:instrText xml:space="preserve"> TC "Appendix B: Words Used in This Book" \l 1 </w:instrText>
+      </w:r>
+      <w:r>
+        <w:fldChar w:fldCharType="end"/>
+      </w:r>
+    </w:p>
+    <w:p>
+      <w:pPr>
+        <w:pStyle w:val="ListBullet"/>
+      </w:pPr>
+      <w:r>
+        <w:rPr>
+          <w:b/>
+        </w:rPr>
+        <w:t xml:space="preserve">Seed:</w:t>
+      </w:r>
+      <w:r>
+        <w:t xml:space="preserve"> the number that fixes a world's random history. The same seed and code always give the same world.</w:t>
+      </w:r>
+    </w:p>
+    <w:p>
+      <w:pPr>
+        <w:pStyle w:val="ListBullet"/>
+      </w:pPr>
+      <w:r>
+        <w:rPr>
+          <w:b/>
+        </w:rPr>
+        <w:t xml:space="preserve">Tick:</w:t>
+      </w:r>
+      <w:r>
+        <w:t xml:space="preserve"> one week of the people's time. Fifty-two make a year.</w:t>
+      </w:r>
+    </w:p>
+    <w:p>
+      <w:pPr>
+        <w:pStyle w:val="ListBullet"/>
+      </w:pPr>
+      <w:r>
+        <w:rPr>
+          <w:b/>
+        </w:rPr>
+        <w:t xml:space="preserve">Band:</w:t>
+      </w:r>
+      <w:r>
+        <w:t xml:space="preserve"> one of the founding groups of five, each starting on its own island.</w:t>
+      </w:r>
+    </w:p>
+    <w:p>
+      <w:pPr>
+        <w:pStyle w:val="ListBullet"/>
+      </w:pPr>
+      <w:r>
+        <w:rPr>
+          <w:b/>
+        </w:rPr>
+        <w:t xml:space="preserve">Kind:</w:t>
+      </w:r>
+      <w:r>
+        <w:t xml:space="preserve"> a made thing's lasting properties, each grouped into one of five bands, so near-identical things count as one kind.</w:t>
+      </w:r>
+    </w:p>
+    <w:p>
+      <w:pPr>
+        <w:pStyle w:val="ListBullet"/>
+      </w:pPr>
+      <w:r>
+        <w:rPr>
+          <w:b/>
+        </w:rPr>
+        <w:t xml:space="preserve">Novelty:</w:t>
+      </w:r>
+      <w:r>
+        <w:t xml:space="preserve"> a kind or behaviour new to the world, made or done by three or more people within ten years of first appearing.</w:t>
+      </w:r>
+    </w:p>
+    <w:p>
+      <w:pPr>
+        <w:pStyle w:val="ListBullet"/>
+      </w:pPr>
+      <w:r>
+        <w:rPr>
+          <w:b/>
+        </w:rPr>
+        <w:t xml:space="preserve">Lasting novelty:</w:t>
+      </w:r>
+      <w:r>
+        <w:t xml:space="preserve"> a novelty still being made or done fifty or more years after it first appeared.</w:t>
+      </w:r>
+    </w:p>
+    <w:p>
+      <w:pPr>
+        <w:pStyle w:val="ListBullet"/>
+      </w:pPr>
+      <w:r>
+        <w:rPr>
+          <w:b/>
+        </w:rPr>
+        <w:t xml:space="preserve">LFA, latest first appearance:</w:t>
+      </w:r>
+      <w:r>
+        <w:t xml:space="preserve"> the first year of the latest lasting novelty in a world. A world that keeps producing new things has a late LFA.</w:t>
+      </w:r>
+    </w:p>
+    <w:p>
+      <w:pPr>
+        <w:pStyle w:val="ListBullet"/>
+      </w:pPr>
+      <w:r>
+        <w:rPr>
+          <w:b/>
+        </w:rPr>
+        <w:t xml:space="preserve">Tradition:</w:t>
+      </w:r>
+      <w:r>
+        <w:t xml:space="preserve"> a technique, belief or mark held by three or more people in every ten-year sample over a long stretch.</w:t>
+      </w:r>
+    </w:p>
+    <w:p>
+      <w:pPr>
+        <w:pStyle w:val="ListBullet"/>
+      </w:pPr>
+      <w:r>
+        <w:rPr>
+          <w:b/>
+        </w:rPr>
+        <w:t xml:space="preserve">FEC, first encounter count:</w:t>
+      </w:r>
+      <w:r>
+        <w:t xml:space="preserve"> in E7, how often the world itself performs a transformation in front of someone, such as rain filling a vessel or a fire hardening clay.</w:t>
+      </w:r>
+    </w:p>
+    <w:p>
+      <w:pPr>
+        <w:pStyle w:val="ListBullet"/>
+      </w:pPr>
+      <w:r>
+        <w:rPr>
+          <w:b/>
+        </w:rPr>
+        <w:t xml:space="preserve">Historian:</w:t>
+      </w:r>
+      <w:r>
+        <w:t xml:space="preserve"> the read-only observer that names firsts after they happen. It never influences anyone.</w:t>
+      </w:r>
+    </w:p>
+    <w:p>
+      <w:pPr>
+        <w:pStyle w:val="ListBullet"/>
+      </w:pPr>
+      <w:r>
+        <w:rPr>
+          <w:b/>
+        </w:rPr>
+        <w:t xml:space="preserve">Autopsy:</w:t>
+      </w:r>
+      <w:r>
+        <w:t xml:space="preserve"> a read-only replay of a finished world, with probes, to find where a chain of discovery broke.</w:t>
+      </w:r>
+    </w:p>
+    <w:p>
+      <w:pPr>
+        <w:pStyle w:val="ListBullet"/>
+      </w:pPr>
+      <w:r>
+        <w:rPr>
+          <w:b/>
+        </w:rPr>
+        <w:t xml:space="preserve">Replay:</w:t>
+      </w:r>
+      <w:r>
+        <w:t xml:space="preserve"> running a saved world again from its seed, to watch it more closely. A replay is trusted only if it reproduces the saved world exactly.</w:t>
+      </w:r>
+    </w:p>
+    <w:p>
+      <w:pPr>
+        <w:pStyle w:val="ChapterLabel"/>
+      </w:pPr>
+      <w:r>
+        <w:t xml:space="preserve">APPENDIX C</w:t>
+      </w:r>
+    </w:p>
+    <w:p>
+      <w:pPr>
+        <w:pStyle w:val="Heading1Plain"/>
+      </w:pPr>
+      <w:r>
+        <w:t xml:space="preserve">Sources</w:t>
+      </w:r>
+      <w:r>
+        <w:fldChar w:fldCharType="begin"/>
+      </w:r>
+      <w:r>
+        <w:instrText xml:space="preserve"> TC "Appendix C: Sources" \l 1 </w:instrText>
+      </w:r>
+      <w:r>
+        <w:fldChar w:fldCharType="end"/>
+      </w:r>
+    </w:p>
+    <w:p>
+      <w:pPr>
+        <w:pStyle w:val="BodyFirst"/>
+      </w:pPr>
+      <w:r>
+        <w:rPr>
+          <w:smallCaps/>
+        </w:rPr>
+        <w:t xml:space="preserve">Artificial worlds and</w:t>
+      </w:r>
+      <w:r>
+        <w:t xml:space="preserve"> agents:</w:t>
+      </w:r>
+    </w:p>
+    <w:p>
+      <w:pPr>
+        <w:pStyle w:val="ListBullet"/>
+      </w:pPr>
+      <w:r>
+        <w:t xml:space="preserve">Lu, C., Beukman, M., Matthews, M. and Foerster, J. (2024). JaxLife: An Open-Ended Agentic Simulator. arXiv:2409.00853. Code: github.com/luchris429/JaxLife.</w:t>
+      </w:r>
+    </w:p>
+    <w:p>
+      <w:pPr>
+        <w:pStyle w:val="ListBullet"/>
+      </w:pPr>
+      <w:r>
+        <w:t xml:space="preserve">Werld: agentic life simulation from inception. Open-source project, github.com/nocodemf/werld.</w:t>
+      </w:r>
+    </w:p>
+    <w:p>
+      <w:pPr>
+        <w:pStyle w:val="ListBullet"/>
+      </w:pPr>
+      <w:r>
+        <w:t xml:space="preserve">Ren, J., Zhuang, Y., Ye, X., Mao, L. and others (2025). SimWorld: An Open-ended Realistic Simulator for Autonomous Agents in Physical and Social Worlds. arXiv:2512.01078.</w:t>
+      </w:r>
+    </w:p>
+    <w:p>
+      <w:pPr>
+        <w:pStyle w:val="ListBullet"/>
+      </w:pPr>
+      <w:r>
+        <w:t xml:space="preserve">Park, J. S., O'Brien, J. C., Cai, C. J., Morris, M. R. and others (2023). Generative Agents: Interactive Simulacra of Human Behavior. arXiv:2304.03442.</w:t>
+      </w:r>
+    </w:p>
+    <w:p>
+      <w:pPr>
+        <w:pStyle w:val="ListBullet"/>
+      </w:pPr>
+      <w:r>
+        <w:t xml:space="preserve">Altera.AL and others (2024). Project Sid: Many-agent simulations toward AI civilization. arXiv:2411.00114.</w:t>
+      </w:r>
+    </w:p>
+    <w:p>
+      <w:pPr>
+        <w:pStyle w:val="ListBullet"/>
+      </w:pPr>
+      <w:r>
+        <w:t xml:space="preserve">Epstein, J. M. and Axtell, R. (1996). Growing Artificial Societies: Social Science from the Bottom Up. MIT Press.</w:t>
+      </w:r>
+    </w:p>
+    <w:p>
+      <w:pPr>
+        <w:pStyle w:val="ListBullet"/>
+      </w:pPr>
+      <w:r>
+        <w:t xml:space="preserve">Ofria, C. and Wilke, C. O. (2004). Avida: A Software Platform for Research in Computational Evolutionary Biology. Artificial Life 10(2).</w:t>
+      </w:r>
+    </w:p>
+    <w:p>
+      <w:pPr>
+        <w:pStyle w:val="BodyFirst"/>
+      </w:pPr>
+      <w:r>
+        <w:rPr>
+          <w:smallCaps/>
+        </w:rPr>
+        <w:t xml:space="preserve">Learning agents that</w:t>
+      </w:r>
+      <w:r>
+        <w:t xml:space="preserve"> learn from each other:</w:t>
+      </w:r>
+    </w:p>
+    <w:p>
+      <w:pPr>
+        <w:pStyle w:val="ListBullet"/>
+      </w:pPr>
+      <w:r>
+        <w:t xml:space="preserve">Ndousse, K., Eck, D., Levine, S. and Jaques, N. (2021). Emergent Social Learning via Multi-agent Reinforcement Learning. ICML 2021; arXiv:2010.00581.</w:t>
+      </w:r>
+    </w:p>
+    <w:p>
+      <w:pPr>
+        <w:pStyle w:val="ListBullet"/>
+      </w:pPr>
+      <w:r>
+        <w:t xml:space="preserve">Cook, J., Lu, C., Hughes, E., Leibo, J. Z. and Foerster, J. (2024). Artificial Generational Intelligence: Cultural Accumulation in Reinforcement Learning. arXiv:2406.00392.</w:t>
+      </w:r>
+    </w:p>
+    <w:p>
+      <w:pPr>
+        <w:pStyle w:val="BodyFirst"/>
+      </w:pPr>
+      <w:r>
+        <w:rPr>
+          <w:smallCaps/>
+        </w:rPr>
+        <w:t xml:space="preserve">Human cultural evolution:</w:t>
+      </w:r>
+    </w:p>
+    <w:p>
+      <w:pPr>
+        <w:pStyle w:val="ListBullet"/>
+      </w:pPr>
+      <w:r>
+        <w:t xml:space="preserve">Henrich, J. and Gil-White, F. J. (2001). The evolution of prestige: freely conferred deference as a mechanism for enhancing the benefits of cultural transmission. Evolution and Human Behavior 22(3).</w:t>
+      </w:r>
+    </w:p>
+    <w:p>
+      <w:pPr>
+        <w:pStyle w:val="ListBullet"/>
+      </w:pPr>
+      <w:r>
+        <w:t xml:space="preserve">Henrich, J. (2004). Demography and Cultural Evolution: How Adaptive Cultural Processes Can Produce Maladaptive Losses. The Tasmanian Case. American Antiquity 69(2).</w:t>
+      </w:r>
+    </w:p>
+    <w:p>
+      <w:pPr>
+        <w:pStyle w:val="ListBullet"/>
+      </w:pPr>
+      <w:r>
+        <w:t xml:space="preserve">Kline, M. A. and Boyd, R. (2010). Population size predicts technological complexity in Oceania. Proceedings of the Royal Society B 277.</w:t>
+      </w:r>
+    </w:p>
+    <w:p>
+      <w:pPr>
+        <w:pStyle w:val="ListBullet"/>
+      </w:pPr>
+      <w:r>
+        <w:t xml:space="preserve">Derex, M., Beugin, M.-P., Godelle, B. and Raymond, M. (2013). Experimental evidence for the influence of group size on cultural complexity. Nature 503.</w:t>
+      </w:r>
+    </w:p>
+    <w:p>
+      <w:pPr>
+        <w:pStyle w:val="ListBullet"/>
+      </w:pPr>
+      <w:r>
+        <w:t xml:space="preserve">Binford, L. R. (1980). Willow Smoke and Dogs' Tails: Hunter-Gatherer Settlement Systems and Archaeological Site Formation. American Antiquity 45(1).</w:t>
+      </w:r>
+    </w:p>
+    <w:p>
+      <w:pPr>
+        <w:pStyle w:val="ListBullet"/>
+      </w:pPr>
+      <w:r>
+        <w:t xml:space="preserve">Testart, A. (1982). The Significance of Food Storage Among Hunter-Gatherers: Residence Patterns, Population Densities, and Social Inequalities. Current Anthropology 23(5).</w:t>
+      </w:r>
+    </w:p>
+    <w:p>
+      <w:pPr>
+        <w:pStyle w:val="ListBullet"/>
+      </w:pPr>
+      <w:r>
+        <w:t xml:space="preserve">Woodburn, J. (1982). Egalitarian societies. Man 17. doi:10.2307/2801707.</w:t>
+      </w:r>
+    </w:p>
+    <w:p>
+      <w:pPr>
+        <w:pStyle w:val="BodyFirst"/>
+      </w:pPr>
+      <w:r>
+        <w:rPr>
+          <w:smallCaps/>
+        </w:rPr>
+        <w:t xml:space="preserve">Hunger, foresight and</w:t>
+      </w:r>
+      <w:r>
+        <w:t xml:space="preserve"> the body (checked for N1; abstracts via PubMed where marked):</w:t>
+      </w:r>
+    </w:p>
+    <w:p>
+      <w:pPr>
+        <w:pStyle w:val="ListBullet"/>
+      </w:pPr>
+      <w:r>
+        <w:t xml:space="preserve">Cabanac, M. (1971). Physiological role of pleasure. Science 173(4002): 1103–1107. doi:10.1126/science.173.4002.1103 (PubMed).</w:t>
+      </w:r>
+    </w:p>
+    <w:p>
+      <w:pPr>
+        <w:pStyle w:val="ListBullet"/>
+      </w:pPr>
+      <w:r>
+        <w:t xml:space="preserve">Layard, R., Mayraz, G. and Nickell, S. (2008). The marginal utility of income. Journal of Public Economics. doi:10.1016/j.jpubeco.2008.01.007.</w:t>
+      </w:r>
+    </w:p>
+    <w:p>
+      <w:pPr>
+        <w:pStyle w:val="ListBullet"/>
+      </w:pPr>
+      <w:r>
+        <w:t xml:space="preserve">Malmendier, U. and Nagel, S. (2011). Depression babies: do macroeconomic experiences affect risk taking? Quarterly Journal of Economics 126(1). doi:10.1093/qje/qjq004.</w:t>
+      </w:r>
+    </w:p>
+    <w:p>
+      <w:pPr>
+        <w:pStyle w:val="ListBullet"/>
+      </w:pPr>
+      <w:r>
+        <w:t xml:space="preserve">Nettle, D., Andrews, C. and Bateson, M. (2016). Food insecurity as a driver of obesity in humans: the insurance hypothesis. Behavioral and Brain Sciences 40: e105. doi:10.1017/S0140525X16000947 (PubMed).</w:t>
+      </w:r>
+    </w:p>
+    <w:p>
+      <w:pPr>
+        <w:pStyle w:val="ListBullet"/>
+      </w:pPr>
+      <w:r>
+        <w:t xml:space="preserve">Shah, A. K., Mullainathan, S. and Shafir, E. (2012). Some consequences of having too little. Science 338(6107): 682–685. doi:10.1126/science.1222426 (PubMed).</w:t>
+      </w:r>
+    </w:p>
+    <w:p>
+      <w:pPr>
+        <w:pStyle w:val="ListBullet"/>
+      </w:pPr>
+      <w:r>
+        <w:t xml:space="preserve">Suddendorf, T. and Corballis, M. C. (2007). The evolution of foresight: what is mental time travel, and is it unique to humans? Behavioral and Brain Sciences 30(3): 299–313. doi:10.1017/S0140525X07001975 (PubMed).</w:t>
+      </w:r>
+    </w:p>
+    <w:p>
+      <w:pPr>
+        <w:pStyle w:val="ListBullet"/>
+      </w:pPr>
+      <w:r>
+        <w:t xml:space="preserve">Frederick, S., Loewenstein, G. and O'Donoghue, T. (2002). Time discounting and time preference: a critical review. Journal of Economic Literature 40(2): 351. doi:10.1257/jel.40.2.351.</w:t>
+      </w:r>
+    </w:p>
+    <w:p>
+      <w:pPr>
+        <w:pStyle w:val="ListBullet"/>
+      </w:pPr>
+      <w:r>
+        <w:t xml:space="preserve">Mischel, W., Shoda, Y. and Rodriguez, M. L. (1989). Delay of gratification in children. Science. doi:10.1126/science.2658056.</w:t>
+      </w:r>
+    </w:p>
+    <w:p>
+      <w:pPr>
+        <w:pStyle w:val="ListBullet"/>
+      </w:pPr>
+      <w:r>
+        <w:t xml:space="preserve">Wells, J. C. K. (2006). The evolution of human fatness and susceptibility to obesity: an ethological approach. Biological Reviews 81(2): 183–205. doi:10.1017/S1464793105006974 (PubMed).</w:t>
+      </w:r>
+    </w:p>
+    <w:p>
+      <w:pPr>
+        <w:pStyle w:val="ListBullet"/>
+      </w:pPr>
+      <w:r>
+        <w:t xml:space="preserve">Simondon, K. B. and others (2004). Season of birth is not associated with risk of early adult death in rural Senegal. International Journal of Epidemiology 33(1): 130–136. doi:10.1093/ije/dyg279 (PubMed).</w:t>
+      </w:r>
+    </w:p>
+    <w:p>
+      <w:pPr>
+        <w:pStyle w:val="ChapterLabel"/>
+      </w:pPr>
+      <w:r>
+        <w:t xml:space="preserve">APPENDIX D</w:t>
+      </w:r>
+    </w:p>
+    <w:p>
+      <w:pPr>
+        <w:pStyle w:val="Heading1Plain"/>
       </w:pPr>
       <w:r>
         <w:t xml:space="preserve">How This Book Is Kept</w:t>
@@ -11929,7 +13722,7 @@
         <w:fldChar w:fldCharType="begin"/>
       </w:r>
       <w:r>
-        <w:instrText xml:space="preserve"> TC "119.  How This Book Is Kept" \l 2 </w:instrText>
+        <w:instrText xml:space="preserve"> TC "Appendix D: How This Book Is Kept" \l 1 </w:instrText>
       </w:r>
       <w:r>
         <w:fldChar w:fldCharType="end"/>
@@ -12025,1585 +13818,6 @@
       </w:r>
       <w:r>
         <w:t xml:space="preserve"> what ACL is. This book is meant to show how ACL became what it is.</w:t>
-      </w:r>
-    </w:p>
-    <w:p>
-      <w:pPr>
-        <w:pStyle w:val="ChapterLabel"/>
-      </w:pPr>
-      <w:r>
-        <w:t xml:space="preserve">APPENDIX A</w:t>
-      </w:r>
-    </w:p>
-    <w:p>
-      <w:pPr>
-        <w:pStyle w:val="Heading1Plain"/>
-      </w:pPr>
-      <w:r>
-        <w:t xml:space="preserve">Timeline</w:t>
-      </w:r>
-      <w:r>
-        <w:fldChar w:fldCharType="begin"/>
-      </w:r>
-      <w:r>
-        <w:instrText xml:space="preserve"> TC "Appendix A: Timeline" \l 1 </w:instrText>
-      </w:r>
-      <w:r>
-        <w:fldChar w:fldCharType="end"/>
-      </w:r>
-    </w:p>
-    <w:p>
-      <w:pPr>
-        <w:pStyle w:val="BodyFirst"/>
-      </w:pPr>
-      <w:r>
-        <w:rPr>
-          <w:smallCaps/>
-        </w:rPr>
-        <w:t xml:space="preserve">Dates are as</w:t>
-      </w:r>
-      <w:r>
-        <w:t xml:space="preserve"> recorded in the repository. World Bible versions 1 to 6 are not preserved in the record.</w:t>
-      </w:r>
-    </w:p>
-    <w:p>
-      <w:pPr>
-        <w:pStyle w:val="ListBullet"/>
-      </w:pPr>
-      <w:r>
-        <w:rPr>
-          <w:b/>
-        </w:rPr>
-        <w:t xml:space="preserve">Before the record.</w:t>
-      </w:r>
-      <w:r>
-        <w:t xml:space="preserve"> The founding question; Bob; the rule that nature is programmed and culture written by nobody; World Bible versions up to 7.1.</w:t>
-      </w:r>
-    </w:p>
-    <w:p>
-      <w:pPr>
-        <w:pStyle w:val="ListBullet"/>
-      </w:pPr>
-      <w:r>
-        <w:rPr>
-          <w:b/>
-        </w:rPr>
-        <w:t xml:space="preserve">E0.</w:t>
-      </w:r>
-      <w:r>
-        <w:t xml:space="preserve"> A mind before civilization. Ten founders, 500 days. Frozen predictions begin.</w:t>
-      </w:r>
-    </w:p>
-    <w:p>
-      <w:pPr>
-        <w:pStyle w:val="ListBullet"/>
-      </w:pPr>
-      <w:r>
-        <w:rPr>
-          <w:b/>
-        </w:rPr>
-        <w:t xml:space="preserve">E1.</w:t>
-      </w:r>
-      <w:r>
-        <w:t xml:space="preserve"> The first long histories. Culture appears; the raft is invented and not used; trust follows food; Kaileir kills Ludol.</w:t>
-      </w:r>
-    </w:p>
-    <w:p>
-      <w:pPr>
-        <w:pStyle w:val="ListBullet"/>
-      </w:pPr>
-      <w:r>
-        <w:rPr>
-          <w:b/>
-        </w:rPr>
-        <w:t xml:space="preserve">2 October 2026 — E2.</w:t>
-      </w:r>
-      <w:r>
-        <w:t xml:space="preserve"> The four changes. Testing, reputation, records and floating work; population falls by 40%.</w:t>
-      </w:r>
-    </w:p>
-    <w:p>
-      <w:pPr>
-        <w:pStyle w:val="ListBullet"/>
-      </w:pPr>
-      <w:r>
-        <w:rPr>
-          <w:b/>
-        </w:rPr>
-        <w:t xml:space="preserve">E3.</w:t>
-      </w:r>
-      <w:r>
-        <w:t xml:space="preserve"> The missing births. Inconclusive.</w:t>
-      </w:r>
-    </w:p>
-    <w:p>
-      <w:pPr>
-        <w:pStyle w:val="ListBullet"/>
-      </w:pPr>
-      <w:r>
-        <w:rPr>
-          <w:b/>
-        </w:rPr>
-        <w:t xml:space="preserve">E4.</w:t>
-      </w:r>
-      <w:r>
-        <w:t xml:space="preserve"> Twenty-four worlds. The effect is real; the cause is isolation.</w:t>
-      </w:r>
-    </w:p>
-    <w:p>
-      <w:pPr>
-        <w:pStyle w:val="ListBullet"/>
-      </w:pPr>
-      <w:r>
-        <w:rPr>
-          <w:b/>
-        </w:rPr>
-        <w:t xml:space="preserve">E5.</w:t>
-      </w:r>
-      <w:r>
-        <w:t xml:space="preserve"> The millennium. Thousand-year traditions; two peoples who never met; the freeze.</w:t>
-      </w:r>
-    </w:p>
-    <w:p>
-      <w:pPr>
-        <w:pStyle w:val="ListBullet"/>
-      </w:pPr>
-      <w:r>
-        <w:rPr>
-          <w:b/>
-        </w:rPr>
-        <w:t xml:space="preserve">3 October 2026 — World Bible 8.1.</w:t>
-      </w:r>
-      <w:r>
-        <w:t xml:space="preserve"> Laws 121 to 125 written from the first runs; the method set down as M1 to M9.</w:t>
-      </w:r>
-    </w:p>
-    <w:p>
-      <w:pPr>
-        <w:pStyle w:val="ListBullet"/>
-      </w:pPr>
-      <w:r>
-        <w:rPr>
-          <w:b/>
-        </w:rPr>
-        <w:t xml:space="preserve">E6.</w:t>
-      </w:r>
-      <w:r>
-        <w:t xml:space="preserve"> Richer matter. Bottleneck remains.</w:t>
-      </w:r>
-    </w:p>
-    <w:p>
-      <w:pPr>
-        <w:pStyle w:val="ListBullet"/>
-      </w:pPr>
-      <w:r>
-        <w:rPr>
-          <w:b/>
-        </w:rPr>
-        <w:t xml:space="preserve">E6.5, E6.6.</w:t>
-      </w:r>
-      <w:r>
-        <w:t xml:space="preserve"> The autopsies. Beimak and Reibik; the interaction bottleneck; delayed learning shown to work.</w:t>
-      </w:r>
-    </w:p>
-    <w:p>
-      <w:pPr>
-        <w:pStyle w:val="ListBullet"/>
-      </w:pPr>
-      <w:r>
-        <w:rPr>
-          <w:b/>
-        </w:rPr>
-        <w:t xml:space="preserve">3 October 2026 — E7 designed and frozen.</w:t>
-      </w:r>
-    </w:p>
-    <w:p>
-      <w:pPr>
-        <w:pStyle w:val="ListBullet"/>
-      </w:pPr>
-      <w:r>
-        <w:rPr>
-          <w:b/>
-        </w:rPr>
-        <w:t xml:space="preserve">4 October 2026 — E7 audited, fixed and launched.</w:t>
-      </w:r>
-      <w:r>
-        <w:t xml:space="preserve"> Six problems fixed before any world ran.</w:t>
-      </w:r>
-    </w:p>
-    <w:p>
-      <w:pPr>
-        <w:pStyle w:val="ListBullet"/>
-      </w:pPr>
-      <w:r>
-        <w:rPr>
-          <w:b/>
-        </w:rPr>
-        <w:t xml:space="preserve">4 October 2026 — E7 results.</w:t>
-      </w:r>
-      <w:r>
-        <w:t xml:space="preserve"> Valid. Fire hardens clay hundreds of times; water almost never; bottleneck remains.</w:t>
-      </w:r>
-    </w:p>
-    <w:p>
-      <w:pPr>
-        <w:pStyle w:val="ListBullet"/>
-      </w:pPr>
-      <w:r>
-        <w:rPr>
-          <w:b/>
-        </w:rPr>
-        <w:t xml:space="preserve">4 October 2026 — E7.5.</w:t>
-      </w:r>
-      <w:r>
-        <w:t xml:space="preserve"> The year-115 novelty is a duller flint flake, made by unskilled people.</w:t>
-      </w:r>
-    </w:p>
-    <w:p>
-      <w:pPr>
-        <w:pStyle w:val="ListBullet"/>
-      </w:pPr>
-      <w:r>
-        <w:rPr>
-          <w:b/>
-        </w:rPr>
-        <w:t xml:space="preserve">4 October 2026 — E7.6 and E7.7 frozen and launched.</w:t>
-      </w:r>
-      <w:r>
-        <w:t xml:space="preserve"> The memory ceiling and the narrowness of watching found in the code.</w:t>
-      </w:r>
-    </w:p>
-    <w:p>
-      <w:pPr>
-        <w:pStyle w:val="ListBullet"/>
-      </w:pPr>
-      <w:r>
-        <w:rPr>
-          <w:b/>
-        </w:rPr>
-        <w:t xml:space="preserve">5 October 2026 — E7.6 and E7.7 results.</w:t>
-      </w:r>
-      <w:r>
-        <w:t xml:space="preserve"> Valid. Crafting skill collapses tenfold; deliberate making collapses fortyfold; recipes thin out 4- to 8-fold; watertight vessels never exist; watching produces only 7 copies in 1,770 observations; composite inventions face a 5x memory eviction penalty.</w:t>
-      </w:r>
-    </w:p>
-    <w:p>
-      <w:pPr>
-        <w:pStyle w:val="ListBullet"/>
-      </w:pPr>
-      <w:r>
-        <w:rPr>
-          <w:b/>
-        </w:rPr>
-        <w:t xml:space="preserve">5 October 2026 — E8 (The Crucible) designed and frozen.</w:t>
-      </w:r>
-      <w:r>
-        <w:t xml:space="preserve"> Testing four orthogonal arms against the degenerative loop: making freedom, scaffolded apprenticeship, composite memory protection, and demographic scale.</w:t>
-      </w:r>
-    </w:p>
-    <w:p>
-      <w:pPr>
-        <w:pStyle w:val="ListBullet"/>
-      </w:pPr>
-      <w:r>
-        <w:rPr>
-          <w:b/>
-        </w:rPr>
-        <w:t xml:space="preserve">5 October 2026 — E8 amendment 1.</w:t>
-      </w:r>
-      <w:r>
-        <w:t xml:space="preserve"> Review finds an impossible criterion, a confounded arm and a self-contradiction; one arm is to run first.</w:t>
-      </w:r>
-    </w:p>
-    <w:p>
-      <w:pPr>
-        <w:pStyle w:val="ListBullet"/>
-      </w:pPr>
-      <w:r>
-        <w:rPr>
-          <w:b/>
-        </w:rPr>
-        <w:t xml:space="preserve">5 October 2026 — E8 Arm 1.</w:t>
-      </w:r>
-      <w:r>
-        <w:t xml:space="preserve"> Freeing people to remake what they hold does not free making. No evidence it helps.</w:t>
-      </w:r>
-    </w:p>
-    <w:p>
-      <w:pPr>
-        <w:pStyle w:val="ListBullet"/>
-      </w:pPr>
-      <w:r>
-        <w:rPr>
-          <w:b/>
-        </w:rPr>
-        <w:t xml:space="preserve">5 October 2026 — E8.1.</w:t>
-      </w:r>
-      <w:r>
-        <w:t xml:space="preserve"> Making was never competitive, even for the founders; by the third generation it is weighed less than one week in a hundred and fifty.</w:t>
-      </w:r>
-    </w:p>
-    <w:p>
-      <w:pPr>
-        <w:pStyle w:val="ListBullet"/>
-      </w:pPr>
-      <w:r>
-        <w:rPr>
-          <w:b/>
-        </w:rPr>
-        <w:t xml:space="preserve">5 October 2026 — E8.2.</w:t>
-      </w:r>
-      <w:r>
-        <w:t xml:space="preserve"> Tools add at most 2% of food foraged. The world gives almost no reason to make anything.</w:t>
-      </w:r>
-    </w:p>
-    <w:p>
-      <w:pPr>
-        <w:pStyle w:val="ListBullet"/>
-      </w:pPr>
-      <w:r>
-        <w:rPr>
-          <w:b/>
-        </w:rPr>
-        <w:t xml:space="preserve">5 October 2026 — E8.3.</w:t>
-      </w:r>
-      <w:r>
-        <w:t xml:space="preserve"> 88% of starvation deaths come in winter or early spring; the dead had laid nothing by; not one carried a container.</w:t>
-      </w:r>
-    </w:p>
-    <w:p>
-      <w:pPr>
-        <w:pStyle w:val="ListBullet"/>
-      </w:pPr>
-      <w:r>
-        <w:rPr>
-          <w:b/>
-        </w:rPr>
-        <w:t xml:space="preserve">5 October 2026 — E8.4.</w:t>
-      </w:r>
-      <w:r>
-        <w:t xml:space="preserve"> Autumn offers a median surplus of 163 beyond its own needs; the median adult enters winter with 13. The world allows preparation; nobody prepares.</w:t>
-      </w:r>
-    </w:p>
-    <w:p>
-      <w:pPr>
-        <w:pStyle w:val="ListBullet"/>
-      </w:pPr>
-      <w:r>
-        <w:rPr>
-          <w:b/>
-        </w:rPr>
-        <w:t xml:space="preserve">5 October 2026 — E9.</w:t>
-      </w:r>
-      <w:r>
-        <w:t xml:space="preserve"> Anticipation built from experience, at two pre-stated strengths. Leak test passed; central test failed; for the first time, people fill their hands before winter.</w:t>
-      </w:r>
-    </w:p>
-    <w:p>
-      <w:pPr>
-        <w:pStyle w:val="ListBullet"/>
-      </w:pPr>
-      <w:r>
-        <w:rPr>
-          <w:b/>
-        </w:rPr>
-        <w:t xml:space="preserve">5–6 October 2026 — E9.1.</w:t>
-      </w:r>
-      <w:r>
-        <w:t xml:space="preserve"> The lesson reaches nearly everyone, faintly; only the few who learned it strongly store food.</w:t>
-      </w:r>
-    </w:p>
-    <w:p>
-      <w:pPr>
-        <w:pStyle w:val="ListBullet"/>
-      </w:pPr>
-      <w:r>
-        <w:rPr>
-          <w:b/>
-        </w:rPr>
-        <w:t xml:space="preserve">6 October 2026 — E9.2.</w:t>
-      </w:r>
-      <w:r>
-        <w:t xml:space="preserve"> A carer's food at the start of winter cuts their children's risk of starving five-fold.</w:t>
-      </w:r>
-    </w:p>
-    <w:p>
-      <w:pPr>
-        <w:pStyle w:val="ListBullet"/>
-      </w:pPr>
-      <w:r>
-        <w:rPr>
-          <w:b/>
-        </w:rPr>
-        <w:t xml:space="preserve">6 October 2026 — E10.</w:t>
-      </w:r>
-      <w:r>
-        <w:t xml:space="preserve"> The lesson of a lost child and of a witnessed death, at two witness strengths. Leak test passed; the bereaved forage a little more; no one enters winter with more food.</w:t>
-      </w:r>
-    </w:p>
-    <w:p>
-      <w:pPr>
-        <w:pStyle w:val="ListBullet"/>
-      </w:pPr>
-      <w:r>
-        <w:rPr>
-          <w:b/>
-        </w:rPr>
-        <w:t xml:space="preserve">6 October 2026 — E9.3.</w:t>
-      </w:r>
-      <w:r>
-        <w:t xml:space="preserve"> The first winter planners: ordinary people with a hard lesson; their stores shared and used up; one in 113 plans again.</w:t>
-      </w:r>
-    </w:p>
-    <w:p>
-      <w:pPr>
-        <w:pStyle w:val="ListBullet"/>
-      </w:pPr>
-      <w:r>
-        <w:rPr>
-          <w:b/>
-        </w:rPr>
-        <w:t xml:space="preserve">6 October 2026 — E9.4.</w:t>
-      </w:r>
-      <w:r>
-        <w:t xml:space="preserve"> The self-erasing lesson measured: preparing is a threshold behaviour, and a successful winter drops the lesson below it.</w:t>
-      </w:r>
-    </w:p>
-    <w:p>
-      <w:pPr>
-        <w:pStyle w:val="ListBullet"/>
-      </w:pPr>
-      <w:r>
-        <w:rPr>
-          <w:b/>
-        </w:rPr>
-        <w:t xml:space="preserve">6 October 2026 — E11.</w:t>
-      </w:r>
-      <w:r>
-        <w:t xml:space="preserve"> Stories of hunger deaths carry cause and season to forty thousand hearers, and move each of them very little.</w:t>
-      </w:r>
-    </w:p>
-    <w:p>
-      <w:pPr>
-        <w:pStyle w:val="ListBullet"/>
-      </w:pPr>
-      <w:r>
-        <w:rPr>
-          <w:b/>
-        </w:rPr>
-        <w:t xml:space="preserve">6 October 2026 — E12.</w:t>
-      </w:r>
-      <w:r>
-        <w:t xml:space="preserve"> The planners were visible, generous and respected, and nobody around them changed: no one in ACL can copy what a neighbour does.</w:t>
-      </w:r>
-    </w:p>
-    <w:p>
-      <w:pPr>
-        <w:pStyle w:val="ListBullet"/>
-      </w:pPr>
-      <w:r>
-        <w:rPr>
-          <w:b/>
-        </w:rPr>
-        <w:t xml:space="preserve">6 October 2026 — E13.</w:t>
-      </w:r>
-      <w:r>
-        <w:t xml:space="preserve"> People learn from the foraging of the visibly well fed. Planners fourfold, repeat planning 6.3% against 0.9%; declared failed by its own rule, because its leak test had no one in it to measure.</w:t>
-      </w:r>
-    </w:p>
-    <w:p>
-      <w:pPr>
-        <w:pStyle w:val="ListBullet"/>
-      </w:pPr>
-      <w:r>
-        <w:rPr>
-          <w:b/>
-        </w:rPr>
-        <w:t xml:space="preserve">October 2026 — E13R.</w:t>
-      </w:r>
-      <w:r>
-        <w:t xml:space="preserve"> Sixteen new worlds, a sham arm and an instrumented check: the copying acts only through the watcher's habit. Headline failed (5.6% against 4.3%); planners 2.9×, carers +8.3 points; neighbours unchanged, children not saved. Copying passes a foraging habit, learned from anyone better fed, not a plan.</w:t>
-      </w:r>
-    </w:p>
-    <w:p>
-      <w:pPr>
-        <w:pStyle w:val="ListBullet"/>
-      </w:pPr>
-      <w:r>
-        <w:rPr>
-          <w:b/>
-        </w:rPr>
-        <w:t xml:space="preserve">October 2026 — E13R autopsy.</w:t>
-      </w:r>
-      <w:r>
-        <w:t xml:space="preserve"> Stocked carers still protect children five- to tenfold, but at every level of a carer's food, children in the copying worlds starved more. The copied habit is year-round, not autumn; people go into winter with more food and end it with none. Copying did not help winter.</w:t>
-      </w:r>
-    </w:p>
-    <w:p>
-      <w:pPr>
-        <w:pStyle w:val="ListBullet"/>
-      </w:pPr>
-      <w:r>
-        <w:rPr>
-          <w:b/>
-        </w:rPr>
-        <w:t xml:space="preserve">October 2026 — W1, the winter ledger.</w:t>
-      </w:r>
-      <w:r>
-        <w:t xml:space="preserve"> The creator changes the roadmap's branch after the autopsy. Winter is lived hand to mouth: gathering in winter covers 102% of winter eating, stock at its start 14%. The median family holds a ninth of its winter; stashes are almost unused. Not keeping food: nobody puts any away.</w:t>
-      </w:r>
-    </w:p>
-    <w:p>
-      <w:pPr>
-        <w:pStyle w:val="ListBullet"/>
-      </w:pPr>
-      <w:r>
-        <w:rPr>
-          <w:b/>
-        </w:rPr>
-        <w:t xml:space="preserve">October 2026 — S1.</w:t>
-      </w:r>
-      <w:r>
-        <w:t xml:space="preserve"> The decision to stash, mapped. Three gates: rarely eligible (13% of adult-weeks, 2.7% in autumn), often displaced by materials, usually outscored, mostly by giving (39%) and other social actions; foraging wins only 4%. Stashers learn it kept food better than carrying it; the belief spreads; belief is not what is missing.</w:t>
-      </w:r>
-    </w:p>
-    <w:p>
-      <w:pPr>
-        <w:pStyle w:val="ListBullet"/>
-      </w:pPr>
-      <w:r>
-        <w:rPr>
-          <w:b/>
-        </w:rPr>
-        <w:t xml:space="preserve">October 2026 — G1.</w:t>
-      </w:r>
-      <w:r>
-        <w:t xml:space="preserve"> Who receives the food. 72% of gifts go to family, a third to siblings (in every world); 63% to people with under half a week of food; half is repayment; strangers receive almost nothing. A family's surplus is kept in its members' stomachs and debts, not in a store.</w:t>
-      </w:r>
-    </w:p>
-    <w:p>
-      <w:pPr>
-        <w:pStyle w:val="ListBullet"/>
-      </w:pPr>
-      <w:r>
-        <w:rPr>
-          <w:b/>
-        </w:rPr>
-        <w:t xml:space="preserve">October 2026 — P1.</w:t>
-      </w:r>
-      <w:r>
-        <w:t xml:space="preserve"> Risk pooling or spreading scarcity. Family food protects the poorest strongly (winter starvation 25 times lower with a well-stocked family); people rarely starve amid plenty; giving does not leave givers hungry. But help follows only one hungry week in ten, families hold a ninth of their winter, and more sharing brings no better winters. A pool with almost nothing in it.</w:t>
-      </w:r>
-    </w:p>
-    <w:p>
-      <w:pPr>
-        <w:pStyle w:val="ListBullet"/>
-      </w:pPr>
-      <w:r>
-        <w:rPr>
-          <w:b/>
-        </w:rPr>
-        <w:t xml:space="preserve">October 2026 — U1.</w:t>
-      </w:r>
-      <w:r>
-        <w:t xml:space="preserve"> E8.4 revisited. The food is on the land and barely touched; autumn is foraged like any season; the carrying limit is never reached. People stop when fed: foraging falls from 86% of autumn weeks with under half a week of food to 6% with two to four weeks. In the code, hunger reaches zero at two weeks, exactly where stashing becomes possible.</w:t>
-      </w:r>
-    </w:p>
-    <w:p>
-      <w:pPr>
-        <w:pStyle w:val="ListBullet"/>
-      </w:pPr>
-      <w:r>
-        <w:rPr>
-          <w:b/>
-        </w:rPr>
-        <w:t xml:space="preserve">October 2026 — N1.</w:t>
-      </w:r>
-      <w:r>
-        <w:t xml:space="preserve"> No code, no experiment: thirteen readings of what a satisfied person should feel, judged for nature, culture, scripting, human capacity and leak. A seasonal instinct and food-as-standing rejected; smooth satiety, insecurity learned from experience, the body as a store, and a longer mind stand out. The creator chooses.</w:t>
-      </w:r>
-    </w:p>
-    <w:p>
-      <w:pPr>
-        <w:pStyle w:val="ListBullet"/>
-      </w:pPr>
-      <w:r>
-        <w:rPr>
-          <w:b/>
-        </w:rPr>
-        <w:t xml:space="preserve">October 2026 — N1, the evidence.</w:t>
-      </w:r>
-      <w:r>
-        <w:t xml:space="preserve"> The human evidence behind four candidates checked against its sources: strong for the body as a store, strong for foresight as a capacity but weak for its use, mixed for learned worry, general for smooth satisfaction. Woodburn's immediate-return societies store little despite full foresight. The least change that answers U1 is smooth satisfaction confined to the pull to gather; changing nothing stays on the table.</w:t>
-      </w:r>
-    </w:p>
-    <w:p>
-      <w:pPr>
-        <w:pStyle w:val="ListBullet"/>
-      </w:pPr>
-      <w:r>
-        <w:rPr>
-          <w:b/>
-        </w:rPr>
-        <w:t xml:space="preserve">October 2026 — N2 and D1.</w:t>
-      </w:r>
-      <w:r>
-        <w:t xml:space="preserve"> The question reframed (ACL may live as an immediate-return society, not a broken one), then tested on the world itself. Food is predictable and storable as seed but thin, and winter leaves the land seven-eighths as full as autumn. Sowing already returns more than twice its seed, yet half its crop feeds others and sowers mostly come away believing it failed. By the creator's rule, changing people's psychology is premature.</w:t>
-      </w:r>
-    </w:p>
-    <w:p>
-      <w:pPr>
-        <w:pStyle w:val="ListBullet"/>
-      </w:pPr>
-      <w:r>
-        <w:rPr>
-          <w:b/>
-        </w:rPr>
-        <w:t xml:space="preserve">October 2026 — D2.</w:t>
-      </w:r>
-      <w:r>
-        <w:t xml:space="preserve"> Why sowers seemed to learn failure. They do not: D1's measure counted forgetting as failure (corrected). Sowers learn that sowing works, but the return is not theirs: the sower's family gets back about what it sowed, others harvest more, and autumn sowing is a loss to the family. Sowing explains part of the absence of delayed return; the lean season and property remain open.</w:t>
-      </w:r>
-    </w:p>
-    <w:p>
-      <w:pPr>
-        <w:pStyle w:val="ListBullet"/>
-      </w:pPr>
-      <w:r>
-        <w:rPr>
-          <w:b/>
-        </w:rPr>
-        <w:t xml:space="preserve">October 2026 — N3.</w:t>
-      </w:r>
-      <w:r>
-        <w:t xml:space="preserve"> Nine readings of a harder lean season, then the evidence: temperate plants are dormant in winter, so zero winter growth is the realistic value; lean seasons vary with climate; foragers meet them with meat, weight loss, movement and storage. The first test chosen: winter growth set to zero, nothing else changed.</w:t>
-      </w:r>
-    </w:p>
-    <w:p>
-      <w:pPr>
-        <w:pStyle w:val="ListBullet"/>
-      </w:pPr>
-      <w:r>
-        <w:rPr>
-          <w:b/>
-        </w:rPr>
-        <w:t xml:space="preserve">October 2026 — L1 frozen, and stopped.</w:t>
-      </w:r>
-      <w:r>
-        <w:t xml:space="preserve"> The survival pilot's rule was triggered (two of four worlds died out) and the experiment did not run. A declared, survival-only check of the same seeds without the change found one world fragile anyway, one killed by the leaner winter, and every surviving leaner world much smaller. The creator chose to redesign the pilot with same-seed controls.</w:t>
-      </w:r>
-    </w:p>
-    <w:p>
-      <w:pPr>
-        <w:pStyle w:val="ListBullet"/>
-      </w:pPr>
-      <w:r>
-        <w:rPr>
-          <w:b/>
-        </w:rPr>
-        <w:t xml:space="preserve">October 2026 — L1 run.</w:t>
-      </w:r>
-      <w:r>
-        <w:t xml:space="preserve"> The redesigned pilot passed (the unchanged worlds died out more often than the leaner ones). The experiment ran as frozen: its manipulation check failed, because the leaner worlds ended with far fewer people and so as much winter food each (a design flaw, admitted: food was measured per person, not per tile). By the frozen rule, a null that says nothing about lean seasons. Observed: a steady lean season is absorbed by density, not by storing.</w:t>
-      </w:r>
-    </w:p>
-    <w:p>
-      <w:pPr>
-        <w:pStyle w:val="ListBullet"/>
-      </w:pPr>
-      <w:r>
-        <w:rPr>
-          <w:b/>
-        </w:rPr>
-        <w:t xml:space="preserve">October 2026 — H-L5, N4 and V1 (overnight).</w:t>
-      </w:r>
-      <w:r>
-        <w:t xml:space="preserve"> The creator's hypothesis that delayed return answers uncertainty, not average scarcity. Candidates for unpredictable winters; evidence that sharing insures only what is not common to the whole group, and that real grassland production varies about a third from year to year against ACL's fourteenth; and a read-only study of ACL's own bad years: deadly, but not teaching storage. A design comparing world-wide with patchy bad years drafted for sign-off.</w:t>
-      </w:r>
-    </w:p>
-    <w:p>
-      <w:pPr>
-        <w:pStyle w:val="ListBullet"/>
-      </w:pPr>
-      <w:r>
-        <w:rPr>
-          <w:b/>
-        </w:rPr>
-        <w:t xml:space="preserve">October 2026 — U stopped at the pilot.</w:t>
-      </w:r>
-      <w:r>
-        <w:t xml:space="preserve"> Signed off for a grassland target. ACL's land smoothed even the widest weather to about 11% variation in food a year (grassland about 37%); at that width the pilot lost 7 and 6 of 8 worlds against the control's 4, with no seed keeping all three arms alive. Hard stop; no behaviour measured; the design returns to the creator.</w:t>
-      </w:r>
-    </w:p>
-    <w:p>
-      <w:pPr>
-        <w:pStyle w:val="ListBullet"/>
-      </w:pPr>
-      <w:r>
-        <w:rPr>
-          <w:b/>
-        </w:rPr>
-        <w:t xml:space="preserve">October 2026 — Rules 12 to 19.</w:t>
-      </w:r>
-      <w:r>
-        <w:t xml:space="preserve"> During the fragility study (F1), eight rules added to the eleven, each paid for by a failure: feasibility before design; manipulation checks anchored to the target; baseline survival first; discovery confirmed on a holdout; every number traceable; nature anchored, not tuned; population beside every measure; corrections appended, not rewritten.</w:t>
-      </w:r>
-    </w:p>
-    <w:p>
-      <w:pPr>
-        <w:pStyle w:val="ListBullet"/>
-      </w:pPr>
-      <w:r>
-        <w:rPr>
-          <w:b/>
-        </w:rPr>
-        <w:t xml:space="preserve">October 2026 — F1, baseline fragility.</w:t>
-      </w:r>
-      <w:r>
-        <w:t xml:space="preserve"> A third of control worlds die out (22 of 64), not from hunger: births stop forty to sixty-five years before the end and the people age out. After the founders people rarely pair, because in a small, scattered people a partner is almost never within sight. Dying worlds can be told apart by their size at year twenty. Read-only; confirmed on 24 new worlds.</w:t>
-      </w:r>
-    </w:p>
-    <w:p>
-      <w:pPr>
-        <w:pStyle w:val="ListBullet"/>
-      </w:pPr>
-      <w:r>
-        <w:rPr>
-          <w:b/>
-        </w:rPr>
-        <w:t xml:space="preserve">October 2026 — Stage 0 reopened; N5.</w:t>
-      </w:r>
-      <w:r>
-        <w:t xml:space="preserve"> The creator reopens the world's foundation. Evidence: real foragers find spouses in networks of hundreds, outside the local group, mostly through kin; a viable people needs some 75 to 150 members even with perfect search. ACL's whole world held twenty, searching within sight. Nothing changed; a feasibility question set for the creator.</w:t>
-      </w:r>
-    </w:p>
-    <w:p>
-      <w:pPr>
-        <w:pStyle w:val="ListBullet"/>
-      </w:pPr>
-      <w:r>
-        <w:rPr>
-          <w:b/>
-        </w:rPr>
-        <w:t xml:space="preserve">October 2026 — F2.</w:t>
-      </w:r>
-      <w:r>
-        <w:t xml:space="preserve"> Perfect partner finding, as a diagnostic on the same 64 worlds: 7 died out against 22, verdict "both". Search was most of the problem; the worlds that still died had no eligible partner left anywhere. Once people paired, couples drifted apart and larger peoples met the limit of their food.</w:t>
-      </w:r>
-    </w:p>
-    <w:p>
-      <w:pPr>
-        <w:pStyle w:val="ListBullet"/>
-      </w:pPr>
-      <w:r>
-        <w:rPr>
-          <w:b/>
-        </w:rPr>
-        <w:t xml:space="preserve">October 2026 — C1.</w:t>
-      </w:r>
-      <w:r>
-        <w:t xml:space="preserve"> Why couples drift apart, read-only and confirmed on new worlds: they are apart about half their weeks; two in five of those weeks sit in a gap between two thresholds written separately in the code; foraging splits them and food outbids the pull back. F2's figure on couples apart corrected.</w:t>
-      </w:r>
-    </w:p>
-    <w:p>
-      <w:pPr>
-        <w:pStyle w:val="ListBullet"/>
-      </w:pPr>
-      <w:r>
-        <w:rPr>
-          <w:b/>
-        </w:rPr>
-        <w:t xml:space="preserve">October 2026 — N6.</w:t>
-      </w:r>
-      <w:r>
-        <w:t xml:space="preserve"> How real forager couples live together: apart by day, often, but in the same camp at night. At ACL's weekly step a real couple would be together almost every week; ACL's couples share no home. Candidates set out for the creator; none chosen.</w:t>
-      </w:r>
-    </w:p>
-    <w:p>
-      <w:pPr>
-        <w:pStyle w:val="ListBullet"/>
-      </w:pPr>
-      <w:r>
-        <w:rPr>
-          <w:b/>
-        </w:rPr>
-        <w:t xml:space="preserve">October 2026 — H1.</w:t>
-      </w:r>
-      <w:r>
-        <w:t xml:space="preserve"> How far apart partners' homes lie, read-only: close in only half of couple-weeks, and changing every five or six weeks. Mixed by the frozen rule; a shared home, not only aligned thresholds, is what the evidence points to.</w:t>
-      </w:r>
-    </w:p>
-    <w:p>
-      <w:pPr>
-        <w:pStyle w:val="ListBullet"/>
-      </w:pPr>
-      <w:r>
-        <w:rPr>
-          <w:b/>
-        </w:rPr>
-        <w:t xml:space="preserve">October 2026 — T1.</w:t>
-      </w:r>
-      <w:r>
-        <w:t xml:space="preserve"> The pull toward a partner moved to where conception stops. The manipulation check failed: the pull was there and food outbid it; the outcome was not read. A slight change flipped the fate of 19 of 64 worlds: differences of a few worlds are noise.</w:t>
-      </w:r>
-    </w:p>
-    <w:p>
-      <w:pPr>
-        <w:pStyle w:val="ListBullet"/>
-      </w:pPr>
-      <w:r>
-        <w:rPr>
-          <w:b/>
-        </w:rPr>
-        <w:t xml:space="preserve">October 2026 — HB1.</w:t>
-      </w:r>
-      <w:r>
-        <w:t xml:space="preserve"> A shared home base, with a sham arm. Couples were together almost every week and had more children, but extinction rose (33 of 64 against 22; the sham, 24): families ate the land around homes that did not move with the food. (Not confirmed by HF1; see below.)</w:t>
-      </w:r>
-    </w:p>
-    <w:p>
-      <w:pPr>
-        <w:pStyle w:val="ListBullet"/>
-      </w:pPr>
-      <w:r>
-        <w:rPr>
-          <w:b/>
-        </w:rPr>
-        <w:t xml:space="preserve">October 2026 — HF1.</w:t>
-      </w:r>
-      <w:r>
-        <w:t xml:space="preserve"> The land around HB1's homes measured directly: only about 3% emptier than in the control, on old and new worlds alike. Depletion not confirmed; HB1's hunger has another cause, and the moving home waits.</w:t>
-      </w:r>
-    </w:p>
-    <w:p>
-      <w:pPr>
-        <w:pStyle w:val="ListBullet"/>
-      </w:pPr>
-      <w:r>
-        <w:rPr>
-          <w:b/>
-        </w:rPr>
-        <w:t xml:space="preserve">October 2026 — HF2.</w:t>
-      </w:r>
-      <w:r>
-        <w:t xml:space="preserve"> The household accounts of HB1's hunger: not too many children, not meat. People gave each other about two fifths less food, seen in the first worlds and again in new ones; consistent, not yet confirmed.</w:t>
-      </w:r>
-    </w:p>
-    <w:p>
-      <w:pPr>
-        <w:pStyle w:val="ListBullet"/>
-      </w:pPr>
-      <w:r>
-        <w:rPr>
-          <w:b/>
-        </w:rPr>
-        <w:t xml:space="preserve">October 2026 — HF3.</w:t>
-      </w:r>
-      <w:r>
-        <w:t xml:space="preserve"> The lost gifts did not explain HB1's hunger: help was within reach as often as before, and came less often. After three read-only checks, the hunger is real and unexplained by any single cause tested.</w:t>
-      </w:r>
-    </w:p>
-    <w:p>
-      <w:pPr>
-        <w:pStyle w:val="ListBullet"/>
-      </w:pPr>
-      <w:r>
-        <w:rPr>
-          <w:b/>
-        </w:rPr>
-        <w:t xml:space="preserve">October 2026 — HF4.</w:t>
-      </w:r>
-      <w:r>
-        <w:t xml:space="preserve"> A ledger of the moment of eating: the food people held fell about a fifteenth across the board; by the frozen rule, small shifts explained the hunger, though only about half of the extra starvation. The HB1 question closed; back to keeping couples together another way.</w:t>
-      </w:r>
-    </w:p>
-    <w:p>
-      <w:pPr>
-        <w:pStyle w:val="ListBullet"/>
-      </w:pPr>
-      <w:r>
-        <w:rPr>
-          <w:b/>
-        </w:rPr>
-        <w:t xml:space="preserve">October 2026 — N7.</w:t>
-      </w:r>
-      <w:r>
-        <w:t xml:space="preserve"> Candidates for keeping couples together, then evidence: foragers return to a camp each day and move it when the land around it gives less. A camp that goes where the couple goes is anchored; counting a day's walk as one camp is dropped.</w:t>
-      </w:r>
-    </w:p>
-    <w:p>
-      <w:pPr>
-        <w:pStyle w:val="ListBullet"/>
-      </w:pPr>
-      <w:r>
-        <w:rPr>
-          <w:b/>
-        </w:rPr>
-        <w:t xml:space="preserve">October 2026 — MC1.</w:t>
-      </w:r>
-      <w:r>
-        <w:t xml:space="preserve"> A camp that goes where the couple goes: couples together most weeks, more children, no extra hunger; extinction unchanged within the noise. Pair stability limited births, not survival.</w:t>
-      </w:r>
-    </w:p>
-    <w:p>
-      <w:pPr>
-        <w:pStyle w:val="ListBullet"/>
-      </w:pPr>
-      <w:r>
-        <w:rPr>
-          <w:b/>
-        </w:rPr>
-        <w:t xml:space="preserve">October 2026 — N8.</w:t>
-      </w:r>
-      <w:r>
-        <w:t xml:space="preserve"> How many worlds a test needs (half of perfect finding's effect: about 256), and the evidence for two ways of finding partners: remembering where acquaintances are, not shown; leaving when there is no one, attested, in a form that needs no chosen number.</w:t>
-      </w:r>
-    </w:p>
-    <w:p>
-      <w:pPr>
-        <w:pStyle w:val="ListBullet"/>
-      </w:pPr>
-      <w:r>
-        <w:rPr>
-          <w:b/>
-        </w:rPr>
-        <w:t xml:space="preserve">October 2026 — MC1-L.</w:t>
-      </w:r>
-      <w:r>
-        <w:t xml:space="preserve"> The moving camp re-tested on 256 new worlds: couples together, more children, extinction unchanged (93 against 87); any benefit smaller than half of perfect finding's. Genuinely weak, by the rule written beforehand.</w:t>
-      </w:r>
-    </w:p>
-    <w:p>
-      <w:pPr>
-        <w:pStyle w:val="ListBullet"/>
-      </w:pPr>
-      <w:r>
-        <w:rPr>
-          <w:b/>
-        </w:rPr>
-        <w:t xml:space="preserve">October 2026 — P2.</w:t>
-      </w:r>
-      <w:r>
-        <w:t xml:space="preserve"> Single people with no one in sight would step outward instead of at random. Stopped at its pilot: they almost never had anyone in sight, but they chose to search so seldom (about four weeks in a hundred) that the change barely acted. The question became how much people search, not where.</w:t>
-      </w:r>
-    </w:p>
-    <w:p>
-      <w:pPr>
-        <w:pStyle w:val="ListBullet"/>
-      </w:pPr>
-      <w:r>
-        <w:rPr>
-          <w:b/>
-        </w:rPr>
-        <w:t xml:space="preserve">October 2026 — N9.</w:t>
-      </w:r>
-      <w:r>
-        <w:t xml:space="preserve"> How much the unpartnered search: foragers visit and move often, by every account, but no source read says how often a person goes. No number could be set; the outward step was closed in its present form.</w:t>
-      </w:r>
-    </w:p>
-    <w:p>
-      <w:pPr>
-        <w:pStyle w:val="ListBullet"/>
-      </w:pPr>
-      <w:r>
-        <w:rPr>
-          <w:b/>
-        </w:rPr>
-        <w:t xml:space="preserve">October 2026 — GF1.</w:t>
-      </w:r>
-      <w:r>
-        <w:t xml:space="preserve"> How fluid ACL's groups are: adults living together are still together two years later 78 times in 100, in both discovery and holdout. Forager bands keep their people for months, not years; ACL's keep them for years.</w:t>
-      </w:r>
-    </w:p>
-    <w:p>
-      <w:pPr>
-        <w:pStyle w:val="ListBullet"/>
-      </w:pPr>
-      <w:r>
-        <w:rPr>
-          <w:b/>
-        </w:rPr>
-        <w:t xml:space="preserve">October 2026 — N10.</w:t>
-      </w:r>
-      <w:r>
-        <w:t xml:space="preserve"> Is the world too small? In people, yes: a viable forager people needs 75–150 or more and real ones average about 840; ACL's twenty make a single band. Land alone was not the shortage.</w:t>
-      </w:r>
-    </w:p>
-    <w:p>
-      <w:pPr>
-        <w:pStyle w:val="ListBullet"/>
-      </w:pPr>
-      <w:r>
-        <w:rPr>
-          <w:b/>
-        </w:rPr>
-        <w:t xml:space="preserve">October 2026 — WS1.</w:t>
-      </w:r>
-      <w:r>
-        <w:t xml:space="preserve"> More land, or more people? On 256 new worlds, four times the land changed nothing (108 died out against 107); eighty founders instead of twenty did: 2 died out on the large land, 23 on today's. Not land, but people. Larger founding bands came with them, so the two are not yet separated.</w:t>
-      </w:r>
-    </w:p>
-    <w:p>
-      <w:pPr>
-        <w:pStyle w:val="ListBullet"/>
-      </w:pPr>
-      <w:r>
-        <w:rPr>
-          <w:b/>
-        </w:rPr>
-        <w:t xml:space="preserve">October 2026 — AA1.</w:t>
-      </w:r>
-      <w:r>
-        <w:t xml:space="preserve"> Do the people lean on flaws in the world? One true flaw, local: a hidden land bridge across water at a corner, in about one world in three. And knowledge nobody gave them: people walk toward where an absent loved one is right now (3 in 10 journeys to join someone), and half of all partner searches aim at someone out of sight. Nothing fixed; the creator decides.</w:t>
-      </w:r>
-    </w:p>
-    <w:p>
-      <w:pPr>
-        <w:pStyle w:val="ListBullet"/>
-      </w:pPr>
-      <w:r>
-        <w:rPr>
-          <w:b/>
-        </w:rPr>
-        <w:t xml:space="preserve">October 2026 — LK1.</w:t>
-      </w:r>
-      <w:r>
-        <w:t xml:space="preserve"> The first shortcut taken away: people walked to where they last saw an absent loved one, not to where that person was. Families spent more time apart; partner finding, births and survival did not change (87 worlds died out against 90). The gift held families together, not worlds.</w:t>
-      </w:r>
-    </w:p>
-    <w:p>
-      <w:pPr>
-        <w:pStyle w:val="ListBullet"/>
-      </w:pPr>
-      <w:r>
-        <w:rPr>
-          <w:b/>
-        </w:rPr>
-        <w:t xml:space="preserve">October 2026 — SA1.</w:t>
-      </w:r>
-      <w:r>
-        <w:t xml:space="preserve"> Six hand-chosen numbers, each halved and doubled. How far people see decided the most: at half their sight 49 of 64 worlds died, at double 8 (22 as they are). Every finding about extinction now rests on a number nobody anchored. None was changed.</w:t>
-      </w:r>
-    </w:p>
-    <w:p>
-      <w:pPr>
-        <w:pStyle w:val="ListBullet"/>
-      </w:pPr>
-      <w:r>
-        <w:rPr>
-          <w:b/>
-        </w:rPr>
-        <w:t xml:space="preserve">October 2026 — MB1a.</w:t>
-      </w:r>
-      <w:r>
-        <w:t xml:space="preserve"> Do the bands meet? In today's worlds, right at the line, with no verdict; with eighty founders on the same land, rarely; on four times the land, almost never, and those worlds survived best. Band size, not meeting, carried them.</w:t>
-      </w:r>
-    </w:p>
-    <w:p>
-      <w:pPr>
-        <w:pStyle w:val="ListBullet"/>
-      </w:pPr>
-      <w:r>
-        <w:rPr>
-          <w:b/>
-        </w:rPr>
-        <w:t xml:space="preserve">October 2026 — BL0.</w:t>
-      </w:r>
-      <w:r>
-        <w:t xml:space="preserve"> Do their habits matter, and whose are they? They steer one grown person's choice in seven; but more than half of them is copied whole in conversation, a third is the person's own learning, and everyone ends up nearly alike.</w:t>
-      </w:r>
-    </w:p>
-    <w:p>
-      <w:pPr>
-        <w:pStyle w:val="ListBullet"/>
-      </w:pPr>
-      <w:r>
-        <w:rPr>
-          <w:b/>
-        </w:rPr>
-        <w:t xml:space="preserve">October 2026 — ID1.</w:t>
-      </w:r>
-      <w:r>
-        <w:t xml:space="preserve"> What makes a person who they are? Swapping any one part (habits, memories, beliefs, temperament) changed people no more than chance; everything but temperament together did. Whether they became the other person, and whether they came back, was left unanswered.</w:t>
-      </w:r>
-    </w:p>
-    <w:p>
-      <w:pPr>
-        <w:pStyle w:val="ChapterLabel"/>
-      </w:pPr>
-      <w:r>
-        <w:t xml:space="preserve">APPENDIX B</w:t>
-      </w:r>
-    </w:p>
-    <w:p>
-      <w:pPr>
-        <w:pStyle w:val="Heading1Plain"/>
-      </w:pPr>
-      <w:r>
-        <w:t xml:space="preserve">Words Used in This Book</w:t>
-      </w:r>
-      <w:r>
-        <w:fldChar w:fldCharType="begin"/>
-      </w:r>
-      <w:r>
-        <w:instrText xml:space="preserve"> TC "Appendix B: Words Used in This Book" \l 1 </w:instrText>
-      </w:r>
-      <w:r>
-        <w:fldChar w:fldCharType="end"/>
-      </w:r>
-    </w:p>
-    <w:p>
-      <w:pPr>
-        <w:pStyle w:val="ListBullet"/>
-      </w:pPr>
-      <w:r>
-        <w:rPr>
-          <w:b/>
-        </w:rPr>
-        <w:t xml:space="preserve">Seed:</w:t>
-      </w:r>
-      <w:r>
-        <w:t xml:space="preserve"> the number that fixes a world's random history. The same seed and code always give the same world.</w:t>
-      </w:r>
-    </w:p>
-    <w:p>
-      <w:pPr>
-        <w:pStyle w:val="ListBullet"/>
-      </w:pPr>
-      <w:r>
-        <w:rPr>
-          <w:b/>
-        </w:rPr>
-        <w:t xml:space="preserve">Tick:</w:t>
-      </w:r>
-      <w:r>
-        <w:t xml:space="preserve"> one week of the people's time. Fifty-two make a year.</w:t>
-      </w:r>
-    </w:p>
-    <w:p>
-      <w:pPr>
-        <w:pStyle w:val="ListBullet"/>
-      </w:pPr>
-      <w:r>
-        <w:rPr>
-          <w:b/>
-        </w:rPr>
-        <w:t xml:space="preserve">Band:</w:t>
-      </w:r>
-      <w:r>
-        <w:t xml:space="preserve"> one of the founding groups of five, each starting on its own island.</w:t>
-      </w:r>
-    </w:p>
-    <w:p>
-      <w:pPr>
-        <w:pStyle w:val="ListBullet"/>
-      </w:pPr>
-      <w:r>
-        <w:rPr>
-          <w:b/>
-        </w:rPr>
-        <w:t xml:space="preserve">Kind:</w:t>
-      </w:r>
-      <w:r>
-        <w:t xml:space="preserve"> a made thing's lasting properties, each grouped into one of five bands, so near-identical things count as one kind.</w:t>
-      </w:r>
-    </w:p>
-    <w:p>
-      <w:pPr>
-        <w:pStyle w:val="ListBullet"/>
-      </w:pPr>
-      <w:r>
-        <w:rPr>
-          <w:b/>
-        </w:rPr>
-        <w:t xml:space="preserve">Novelty:</w:t>
-      </w:r>
-      <w:r>
-        <w:t xml:space="preserve"> a kind or behaviour new to the world, made or done by three or more people within ten years of first appearing.</w:t>
-      </w:r>
-    </w:p>
-    <w:p>
-      <w:pPr>
-        <w:pStyle w:val="ListBullet"/>
-      </w:pPr>
-      <w:r>
-        <w:rPr>
-          <w:b/>
-        </w:rPr>
-        <w:t xml:space="preserve">Lasting novelty:</w:t>
-      </w:r>
-      <w:r>
-        <w:t xml:space="preserve"> a novelty still being made or done fifty or more years after it first appeared.</w:t>
-      </w:r>
-    </w:p>
-    <w:p>
-      <w:pPr>
-        <w:pStyle w:val="ListBullet"/>
-      </w:pPr>
-      <w:r>
-        <w:rPr>
-          <w:b/>
-        </w:rPr>
-        <w:t xml:space="preserve">LFA, latest first appearance:</w:t>
-      </w:r>
-      <w:r>
-        <w:t xml:space="preserve"> the first year of the latest lasting novelty in a world. A world that keeps producing new things has a late LFA.</w:t>
-      </w:r>
-    </w:p>
-    <w:p>
-      <w:pPr>
-        <w:pStyle w:val="ListBullet"/>
-      </w:pPr>
-      <w:r>
-        <w:rPr>
-          <w:b/>
-        </w:rPr>
-        <w:t xml:space="preserve">Tradition:</w:t>
-      </w:r>
-      <w:r>
-        <w:t xml:space="preserve"> a technique, belief or mark held by three or more people in every ten-year sample over a long stretch.</w:t>
-      </w:r>
-    </w:p>
-    <w:p>
-      <w:pPr>
-        <w:pStyle w:val="ListBullet"/>
-      </w:pPr>
-      <w:r>
-        <w:rPr>
-          <w:b/>
-        </w:rPr>
-        <w:t xml:space="preserve">FEC, first encounter count:</w:t>
-      </w:r>
-      <w:r>
-        <w:t xml:space="preserve"> in E7, how often the world itself performs a transformation in front of someone, such as rain filling a vessel or a fire hardening clay.</w:t>
-      </w:r>
-    </w:p>
-    <w:p>
-      <w:pPr>
-        <w:pStyle w:val="ListBullet"/>
-      </w:pPr>
-      <w:r>
-        <w:rPr>
-          <w:b/>
-        </w:rPr>
-        <w:t xml:space="preserve">Historian:</w:t>
-      </w:r>
-      <w:r>
-        <w:t xml:space="preserve"> the read-only observer that names firsts after they happen. It never influences anyone.</w:t>
-      </w:r>
-    </w:p>
-    <w:p>
-      <w:pPr>
-        <w:pStyle w:val="ListBullet"/>
-      </w:pPr>
-      <w:r>
-        <w:rPr>
-          <w:b/>
-        </w:rPr>
-        <w:t xml:space="preserve">Autopsy:</w:t>
-      </w:r>
-      <w:r>
-        <w:t xml:space="preserve"> a read-only replay of a finished world, with probes, to find where a chain of discovery broke.</w:t>
-      </w:r>
-    </w:p>
-    <w:p>
-      <w:pPr>
-        <w:pStyle w:val="ListBullet"/>
-      </w:pPr>
-      <w:r>
-        <w:rPr>
-          <w:b/>
-        </w:rPr>
-        <w:t xml:space="preserve">Replay:</w:t>
-      </w:r>
-      <w:r>
-        <w:t xml:space="preserve"> running a saved world again from its seed, to watch it more closely. A replay is trusted only if it reproduces the saved world exactly.</w:t>
-      </w:r>
-    </w:p>
-    <w:p>
-      <w:pPr>
-        <w:pStyle w:val="ChapterLabel"/>
-      </w:pPr>
-      <w:r>
-        <w:t xml:space="preserve">APPENDIX C</w:t>
-      </w:r>
-    </w:p>
-    <w:p>
-      <w:pPr>
-        <w:pStyle w:val="Heading1Plain"/>
-      </w:pPr>
-      <w:r>
-        <w:t xml:space="preserve">Sources</w:t>
-      </w:r>
-      <w:r>
-        <w:fldChar w:fldCharType="begin"/>
-      </w:r>
-      <w:r>
-        <w:instrText xml:space="preserve"> TC "Appendix C: Sources" \l 1 </w:instrText>
-      </w:r>
-      <w:r>
-        <w:fldChar w:fldCharType="end"/>
-      </w:r>
-    </w:p>
-    <w:p>
-      <w:pPr>
-        <w:pStyle w:val="BodyFirst"/>
-      </w:pPr>
-      <w:r>
-        <w:rPr>
-          <w:smallCaps/>
-        </w:rPr>
-        <w:t xml:space="preserve">Artificial worlds and</w:t>
-      </w:r>
-      <w:r>
-        <w:t xml:space="preserve"> agents:</w:t>
-      </w:r>
-    </w:p>
-    <w:p>
-      <w:pPr>
-        <w:pStyle w:val="ListBullet"/>
-      </w:pPr>
-      <w:r>
-        <w:t xml:space="preserve">Lu, C., Beukman, M., Matthews, M. and Foerster, J. (2024). JaxLife: An Open-Ended Agentic Simulator. arXiv:2409.00853. Code: github.com/luchris429/JaxLife.</w:t>
-      </w:r>
-    </w:p>
-    <w:p>
-      <w:pPr>
-        <w:pStyle w:val="ListBullet"/>
-      </w:pPr>
-      <w:r>
-        <w:t xml:space="preserve">Werld: agentic life simulation from inception. Open-source project, github.com/nocodemf/werld.</w:t>
-      </w:r>
-    </w:p>
-    <w:p>
-      <w:pPr>
-        <w:pStyle w:val="ListBullet"/>
-      </w:pPr>
-      <w:r>
-        <w:t xml:space="preserve">Ren, J., Zhuang, Y., Ye, X., Mao, L. and others (2025). SimWorld: An Open-ended Realistic Simulator for Autonomous Agents in Physical and Social Worlds. arXiv:2512.01078.</w:t>
-      </w:r>
-    </w:p>
-    <w:p>
-      <w:pPr>
-        <w:pStyle w:val="ListBullet"/>
-      </w:pPr>
-      <w:r>
-        <w:t xml:space="preserve">Park, J. S., O'Brien, J. C., Cai, C. J., Morris, M. R. and others (2023). Generative Agents: Interactive Simulacra of Human Behavior. arXiv:2304.03442.</w:t>
-      </w:r>
-    </w:p>
-    <w:p>
-      <w:pPr>
-        <w:pStyle w:val="ListBullet"/>
-      </w:pPr>
-      <w:r>
-        <w:t xml:space="preserve">Altera.AL and others (2024). Project Sid: Many-agent simulations toward AI civilization. arXiv:2411.00114.</w:t>
-      </w:r>
-    </w:p>
-    <w:p>
-      <w:pPr>
-        <w:pStyle w:val="ListBullet"/>
-      </w:pPr>
-      <w:r>
-        <w:t xml:space="preserve">Epstein, J. M. and Axtell, R. (1996). Growing Artificial Societies: Social Science from the Bottom Up. MIT Press.</w:t>
-      </w:r>
-    </w:p>
-    <w:p>
-      <w:pPr>
-        <w:pStyle w:val="ListBullet"/>
-      </w:pPr>
-      <w:r>
-        <w:t xml:space="preserve">Ofria, C. and Wilke, C. O. (2004). Avida: A Software Platform for Research in Computational Evolutionary Biology. Artificial Life 10(2).</w:t>
-      </w:r>
-    </w:p>
-    <w:p>
-      <w:pPr>
-        <w:pStyle w:val="BodyFirst"/>
-      </w:pPr>
-      <w:r>
-        <w:rPr>
-          <w:smallCaps/>
-        </w:rPr>
-        <w:t xml:space="preserve">Learning agents that</w:t>
-      </w:r>
-      <w:r>
-        <w:t xml:space="preserve"> learn from each other:</w:t>
-      </w:r>
-    </w:p>
-    <w:p>
-      <w:pPr>
-        <w:pStyle w:val="ListBullet"/>
-      </w:pPr>
-      <w:r>
-        <w:t xml:space="preserve">Ndousse, K., Eck, D., Levine, S. and Jaques, N. (2021). Emergent Social Learning via Multi-agent Reinforcement Learning. ICML 2021; arXiv:2010.00581.</w:t>
-      </w:r>
-    </w:p>
-    <w:p>
-      <w:pPr>
-        <w:pStyle w:val="ListBullet"/>
-      </w:pPr>
-      <w:r>
-        <w:t xml:space="preserve">Cook, J., Lu, C., Hughes, E., Leibo, J. Z. and Foerster, J. (2024). Artificial Generational Intelligence: Cultural Accumulation in Reinforcement Learning. arXiv:2406.00392.</w:t>
-      </w:r>
-    </w:p>
-    <w:p>
-      <w:pPr>
-        <w:pStyle w:val="BodyFirst"/>
-      </w:pPr>
-      <w:r>
-        <w:rPr>
-          <w:smallCaps/>
-        </w:rPr>
-        <w:t xml:space="preserve">Human cultural evolution:</w:t>
-      </w:r>
-    </w:p>
-    <w:p>
-      <w:pPr>
-        <w:pStyle w:val="ListBullet"/>
-      </w:pPr>
-      <w:r>
-        <w:t xml:space="preserve">Henrich, J. and Gil-White, F. J. (2001). The evolution of prestige: freely conferred deference as a mechanism for enhancing the benefits of cultural transmission. Evolution and Human Behavior 22(3).</w:t>
-      </w:r>
-    </w:p>
-    <w:p>
-      <w:pPr>
-        <w:pStyle w:val="ListBullet"/>
-      </w:pPr>
-      <w:r>
-        <w:t xml:space="preserve">Henrich, J. (2004). Demography and Cultural Evolution: How Adaptive Cultural Processes Can Produce Maladaptive Losses. The Tasmanian Case. American Antiquity 69(2).</w:t>
-      </w:r>
-    </w:p>
-    <w:p>
-      <w:pPr>
-        <w:pStyle w:val="ListBullet"/>
-      </w:pPr>
-      <w:r>
-        <w:t xml:space="preserve">Kline, M. A. and Boyd, R. (2010). Population size predicts technological complexity in Oceania. Proceedings of the Royal Society B 277.</w:t>
-      </w:r>
-    </w:p>
-    <w:p>
-      <w:pPr>
-        <w:pStyle w:val="ListBullet"/>
-      </w:pPr>
-      <w:r>
-        <w:t xml:space="preserve">Derex, M., Beugin, M.-P., Godelle, B. and Raymond, M. (2013). Experimental evidence for the influence of group size on cultural complexity. Nature 503.</w:t>
-      </w:r>
-    </w:p>
-    <w:p>
-      <w:pPr>
-        <w:pStyle w:val="ListBullet"/>
-      </w:pPr>
-      <w:r>
-        <w:t xml:space="preserve">Binford, L. R. (1980). Willow Smoke and Dogs' Tails: Hunter-Gatherer Settlement Systems and Archaeological Site Formation. American Antiquity 45(1).</w:t>
-      </w:r>
-    </w:p>
-    <w:p>
-      <w:pPr>
-        <w:pStyle w:val="ListBullet"/>
-      </w:pPr>
-      <w:r>
-        <w:t xml:space="preserve">Testart, A. (1982). The Significance of Food Storage Among Hunter-Gatherers: Residence Patterns, Population Densities, and Social Inequalities. Current Anthropology 23(5).</w:t>
-      </w:r>
-    </w:p>
-    <w:p>
-      <w:pPr>
-        <w:pStyle w:val="ListBullet"/>
-      </w:pPr>
-      <w:r>
-        <w:t xml:space="preserve">Woodburn, J. (1982). Egalitarian societies. Man 17. doi:10.2307/2801707.</w:t>
-      </w:r>
-    </w:p>
-    <w:p>
-      <w:pPr>
-        <w:pStyle w:val="BodyFirst"/>
-      </w:pPr>
-      <w:r>
-        <w:rPr>
-          <w:smallCaps/>
-        </w:rPr>
-        <w:t xml:space="preserve">Hunger, foresight and</w:t>
-      </w:r>
-      <w:r>
-        <w:t xml:space="preserve"> the body (checked for N1; abstracts via PubMed where marked):</w:t>
-      </w:r>
-    </w:p>
-    <w:p>
-      <w:pPr>
-        <w:pStyle w:val="ListBullet"/>
-      </w:pPr>
-      <w:r>
-        <w:t xml:space="preserve">Cabanac, M. (1971). Physiological role of pleasure. Science 173(4002): 1103–1107. doi:10.1126/science.173.4002.1103 (PubMed).</w:t>
-      </w:r>
-    </w:p>
-    <w:p>
-      <w:pPr>
-        <w:pStyle w:val="ListBullet"/>
-      </w:pPr>
-      <w:r>
-        <w:t xml:space="preserve">Layard, R., Mayraz, G. and Nickell, S. (2008). The marginal utility of income. Journal of Public Economics. doi:10.1016/j.jpubeco.2008.01.007.</w:t>
-      </w:r>
-    </w:p>
-    <w:p>
-      <w:pPr>
-        <w:pStyle w:val="ListBullet"/>
-      </w:pPr>
-      <w:r>
-        <w:t xml:space="preserve">Malmendier, U. and Nagel, S. (2011). Depression babies: do macroeconomic experiences affect risk taking? Quarterly Journal of Economics 126(1). doi:10.1093/qje/qjq004.</w:t>
-      </w:r>
-    </w:p>
-    <w:p>
-      <w:pPr>
-        <w:pStyle w:val="ListBullet"/>
-      </w:pPr>
-      <w:r>
-        <w:t xml:space="preserve">Nettle, D., Andrews, C. and Bateson, M. (2016). Food insecurity as a driver of obesity in humans: the insurance hypothesis. Behavioral and Brain Sciences 40: e105. doi:10.1017/S0140525X16000947 (PubMed).</w:t>
-      </w:r>
-    </w:p>
-    <w:p>
-      <w:pPr>
-        <w:pStyle w:val="ListBullet"/>
-      </w:pPr>
-      <w:r>
-        <w:t xml:space="preserve">Shah, A. K., Mullainathan, S. and Shafir, E. (2012). Some consequences of having too little. Science 338(6107): 682–685. doi:10.1126/science.1222426 (PubMed).</w:t>
-      </w:r>
-    </w:p>
-    <w:p>
-      <w:pPr>
-        <w:pStyle w:val="ListBullet"/>
-      </w:pPr>
-      <w:r>
-        <w:t xml:space="preserve">Suddendorf, T. and Corballis, M. C. (2007). The evolution of foresight: what is mental time travel, and is it unique to humans? Behavioral and Brain Sciences 30(3): 299–313. doi:10.1017/S0140525X07001975 (PubMed).</w:t>
-      </w:r>
-    </w:p>
-    <w:p>
-      <w:pPr>
-        <w:pStyle w:val="ListBullet"/>
-      </w:pPr>
-      <w:r>
-        <w:t xml:space="preserve">Frederick, S., Loewenstein, G. and O'Donoghue, T. (2002). Time discounting and time preference: a critical review. Journal of Economic Literature 40(2): 351. doi:10.1257/jel.40.2.351.</w:t>
-      </w:r>
-    </w:p>
-    <w:p>
-      <w:pPr>
-        <w:pStyle w:val="ListBullet"/>
-      </w:pPr>
-      <w:r>
-        <w:t xml:space="preserve">Mischel, W., Shoda, Y. and Rodriguez, M. L. (1989). Delay of gratification in children. Science. doi:10.1126/science.2658056.</w:t>
-      </w:r>
-    </w:p>
-    <w:p>
-      <w:pPr>
-        <w:pStyle w:val="ListBullet"/>
-      </w:pPr>
-      <w:r>
-        <w:t xml:space="preserve">Wells, J. C. K. (2006). The evolution of human fatness and susceptibility to obesity: an ethological approach. Biological Reviews 81(2): 183–205. doi:10.1017/S1464793105006974 (PubMed).</w:t>
-      </w:r>
-    </w:p>
-    <w:p>
-      <w:pPr>
-        <w:pStyle w:val="ListBullet"/>
-      </w:pPr>
-      <w:r>
-        <w:t xml:space="preserve">Simondon, K. B. and others (2004). Season of birth is not associated with risk of early adult death in rural Senegal. International Journal of Epidemiology 33(1): 130–136. doi:10.1093/ije/dyg279 (PubMed).</w:t>
       </w:r>
     </w:p>
     <w:sectPr>

</xml_diff>

<commit_message>
Part One: prologue no longer states a cause the record does not show (creator-approved); old wording kept in Appendix D's corrections; 226 pages
Co-Authored-By: Claude Opus 5.5 <noreply@anthropic.com>
</commit_message>
<xml_diff>
--- a/book/editions/part1/The_World_That_Nobody_Wrote_Part_One.docx
+++ b/book/editions/part1/The_World_That_Nobody_Wrote_Part_One.docx
@@ -1298,6 +1298,14 @@
         <w:pStyle w:val="TOC2"/>
       </w:pPr>
       <w:r>
+        <w:t xml:space="preserve">Corrections to this edition</w:t>
+      </w:r>
+    </w:p>
+    <w:p>
+      <w:pPr>
+        <w:pStyle w:val="TOC2"/>
+      </w:pPr>
+      <w:r>
         <w:fldChar w:fldCharType="end"/>
       </w:r>
     </w:p>
@@ -1378,7 +1386,7 @@
         <w:pStyle w:val="BodyText"/>
       </w:pPr>
       <w:r>
-        <w:t xml:space="preserve">It was not that Reibik could not. It was that nothing inside ever asked. Reibik had lived beside water and had almost never been thirsty, and someone who has never been thirsty does not wonder what a hollow thing might be for. Out on the dry land, meanwhile, other people went thirsty. They had never seen a vessel. Reibik had never known thirst.</w:t>
+        <w:t xml:space="preserve">It was not that Reibik could not. The record shows what Reibik weighed instead: foraging, giving food, talking, going to find people. Filling the vessel never came near the top. In that world, the urge to fill a thing grows with how much thirst a person has known, and Reibik had lived beside water and had known almost none; the urge was a small fraction of an ordinary one. Out on the dry land, meanwhile, other people went thirsty. They had never seen a vessel.</w:t>
       </w:r>
     </w:p>
     <w:p>
@@ -1387,6 +1395,14 @@
       </w:pPr>
       <w:r>
         <w:t xml:space="preserve">The person holding the vessel was never thirsty. The thirsty people had no vessel.</w:t>
+      </w:r>
+    </w:p>
+    <w:p>
+      <w:pPr>
+        <w:pStyle w:val="BodyText"/>
+      </w:pPr>
+      <w:r>
+        <w:t xml:space="preserve">Whether that small urge is the whole reason, the record cannot say. It gives the puzzle, not the answer.</w:t>
       </w:r>
     </w:p>
     <w:p>
@@ -14528,6 +14544,45 @@
       </w:r>
       <w:r>
         <w:t xml:space="preserve"> what ACL is. This book is meant to show how ACL became what it is.</w:t>
+      </w:r>
+    </w:p>
+    <w:p>
+      <w:pPr>
+        <w:pStyle w:val="ChapterLabel"/>
+      </w:pPr>
+      <w:r>
+        <w:t xml:space="preserve"> </w:t>
+      </w:r>
+    </w:p>
+    <w:p>
+      <w:pPr>
+        <w:pStyle w:val="Heading2"/>
+      </w:pPr>
+      <w:r>
+        <w:t xml:space="preserve">Corrections to this edition</w:t>
+      </w:r>
+      <w:r>
+        <w:fldChar w:fldCharType="begin"/>
+      </w:r>
+      <w:r>
+        <w:instrText xml:space="preserve"> TC "Corrections to this edition" \l 2 </w:instrText>
+      </w:r>
+      <w:r>
+        <w:fldChar w:fldCharType="end"/>
+      </w:r>
+    </w:p>
+    <w:p>
+      <w:pPr>
+        <w:pStyle w:val="BodyFirst"/>
+      </w:pPr>
+      <w:r>
+        <w:rPr>
+          <w:b/>
+        </w:rPr>
+        <w:t xml:space="preserve">16 October 2026 — the Prologue.</w:t>
+      </w:r>
+      <w:r>
+        <w:t xml:space="preserve"> The first release of Part One (15 October) said of Reibik: "It was not that Reibik could not. It was that nothing inside ever asked. Reibik had lived beside water and had almost never been thirsty, and someone who has never been thirsty does not wonder what a hollow thing might be for. Out on the dry land, meanwhile, other people went thirsty. They had never seen a vessel. Reibik had never known thirst." That stated a cause more firmly than the record does: it claimed to know what Reibik wondered, made a general law of it, and said "never" where the record says "almost none". The record (the E6 autopsy) shows that filling the vessel never came among Reibik's top four options, and that the urge to fill it, which grows with thirst known, was about 0.04 against 0.3 to 1 for ordinary choices; it does not show that this is the whole reason. The paragraph was rewritten to say only that, with the creator's approval, and the old wording is kept here.</w:t>
       </w:r>
     </w:p>
     <w:sectPr>

</xml_diff>

<commit_message>
Part One prologue: 'almost never thirsty' (as the record says); noted in Appendix D
Co-Authored-By: Claude Opus 5.5 <noreply@anthropic.com>
</commit_message>
<xml_diff>
--- a/book/editions/part1/The_World_That_Nobody_Wrote_Part_One.docx
+++ b/book/editions/part1/The_World_That_Nobody_Wrote_Part_One.docx
@@ -1394,7 +1394,7 @@
         <w:pStyle w:val="BodyText"/>
       </w:pPr>
       <w:r>
-        <w:t xml:space="preserve">The person holding the vessel was never thirsty. The thirsty people had no vessel.</w:t>
+        <w:t xml:space="preserve">The person holding the vessel was almost never thirsty. The thirsty people had no vessel.</w:t>
       </w:r>
     </w:p>
     <w:p>
@@ -14582,7 +14582,7 @@
         <w:t xml:space="preserve">16 October 2026 — the Prologue.</w:t>
       </w:r>
       <w:r>
-        <w:t xml:space="preserve"> The first release of Part One (15 October) said of Reibik: "It was not that Reibik could not. It was that nothing inside ever asked. Reibik had lived beside water and had almost never been thirsty, and someone who has never been thirsty does not wonder what a hollow thing might be for. Out on the dry land, meanwhile, other people went thirsty. They had never seen a vessel. Reibik had never known thirst." That stated a cause more firmly than the record does: it claimed to know what Reibik wondered, made a general law of it, and said "never" where the record says "almost none". The record (the E6 autopsy) shows that filling the vessel never came among Reibik's top four options, and that the urge to fill it, which grows with thirst known, was about 0.04 against 0.3 to 1 for ordinary choices; it does not show that this is the whole reason. The paragraph was rewritten to say only that, with the creator's approval, and the old wording is kept here.</w:t>
+        <w:t xml:space="preserve"> The first release of Part One (15 October) said of Reibik: "It was not that Reibik could not. It was that nothing inside ever asked. Reibik had lived beside water and had almost never been thirsty, and someone who has never been thirsty does not wonder what a hollow thing might be for. Out on the dry land, meanwhile, other people went thirsty. They had never seen a vessel. Reibik had never known thirst." That stated a cause more firmly than the record does: it claimed to know what Reibik wondered, made a general law of it, and said "never" where the record says "almost none". The record (the E6 autopsy) shows that filling the vessel never came among Reibik's top four options, and that the urge to fill it, which grows with thirst known, was about 0.04 against 0.3 to 1 for ordinary choices; it does not show that this is the whole reason. The paragraph was rewritten to say only that, with the creator's approval, and the old wording is kept here. The line after it, "The person holding the vessel was never thirsty", became "almost never thirsty", for the same reason.</w:t>
       </w:r>
     </w:p>
     <w:sectPr>

</xml_diff>